<commit_message>
Actualiza versión final de entregables
</commit_message>
<xml_diff>
--- a/Entregables/Reporte_Proyecto_1.docx
+++ b/Entregables/Reporte_Proyecto_1.docx
@@ -882,15 +882,15 @@
         <w:spacing w:after="0"/>
         <w:jc w:val="both"/>
         <w:rPr>
-          <w:rFonts w:ascii="Cambria Math" w:hAnsi="Cambria Math" w:hint="eastAsia"/>
-          <w:sz w:val="18"/>
-          <w:szCs w:val="18"/>
-          <w:lang w:val="es-CO"/>
-        </w:rPr>
-      </w:pPr>
-      <w:r>
-        <w:rPr>
-          <w:rFonts w:ascii="Cambria Math" w:hAnsi="Cambria Math" w:hint="eastAsia"/>
+          <w:rFonts w:ascii="Cambria Math" w:hAnsi="Cambria Math"/>
+          <w:sz w:val="18"/>
+          <w:szCs w:val="18"/>
+          <w:lang w:val="es-CO"/>
+        </w:rPr>
+      </w:pPr>
+      <w:r>
+        <w:rPr>
+          <w:rFonts w:ascii="Cambria Math" w:hAnsi="Cambria Math"/>
           <w:sz w:val="18"/>
           <w:szCs w:val="18"/>
           <w:lang w:val="es-CO"/>
@@ -899,84 +899,18 @@
       </w:r>
       <w:r>
         <w:rPr>
-          <w:rFonts w:ascii="Cambria Math" w:hAnsi="Cambria Math" w:hint="eastAsia"/>
+          <w:rFonts w:ascii="Cambria Math" w:hAnsi="Cambria Math"/>
           <w:b/>
           <w:bCs/>
           <w:sz w:val="18"/>
           <w:szCs w:val="18"/>
           <w:lang w:val="es-CO"/>
         </w:rPr>
-        <w:t xml:space="preserve">datos </w:t>
-      </w:r>
-      <w:r>
-        <w:rPr>
-          <w:rFonts w:ascii="Cambria Math" w:hAnsi="Cambria Math" w:hint="eastAsia"/>
-          <w:b/>
-          <w:bCs/>
-          <w:sz w:val="18"/>
-          <w:szCs w:val="18"/>
-          <w:lang w:val="es-CO"/>
-        </w:rPr>
-        <w:t>→</w:t>
-      </w:r>
-      <w:r>
-        <w:rPr>
-          <w:rFonts w:ascii="Cambria Math" w:hAnsi="Cambria Math" w:hint="eastAsia"/>
-          <w:b/>
-          <w:bCs/>
-          <w:sz w:val="18"/>
-          <w:szCs w:val="18"/>
-          <w:lang w:val="es-CO"/>
-        </w:rPr>
-        <w:t xml:space="preserve"> análisis </w:t>
-      </w:r>
-      <w:r>
-        <w:rPr>
-          <w:rFonts w:ascii="Cambria Math" w:hAnsi="Cambria Math" w:hint="eastAsia"/>
-          <w:b/>
-          <w:bCs/>
-          <w:sz w:val="18"/>
-          <w:szCs w:val="18"/>
-          <w:lang w:val="es-CO"/>
-        </w:rPr>
-        <w:t>→</w:t>
-      </w:r>
-      <w:r>
-        <w:rPr>
-          <w:rFonts w:ascii="Cambria Math" w:hAnsi="Cambria Math" w:hint="eastAsia"/>
-          <w:b/>
-          <w:bCs/>
-          <w:sz w:val="18"/>
-          <w:szCs w:val="18"/>
-          <w:lang w:val="es-CO"/>
-        </w:rPr>
-        <w:t xml:space="preserve"> visualización </w:t>
-      </w:r>
-      <w:r>
-        <w:rPr>
-          <w:rFonts w:ascii="Cambria Math" w:hAnsi="Cambria Math" w:hint="eastAsia"/>
-          <w:b/>
-          <w:bCs/>
-          <w:sz w:val="18"/>
-          <w:szCs w:val="18"/>
-          <w:lang w:val="es-CO"/>
-        </w:rPr>
-        <w:t>→</w:t>
-      </w:r>
-      <w:r>
-        <w:rPr>
-          <w:rFonts w:ascii="Cambria Math" w:hAnsi="Cambria Math" w:hint="eastAsia"/>
-          <w:b/>
-          <w:bCs/>
-          <w:sz w:val="18"/>
-          <w:szCs w:val="18"/>
-          <w:lang w:val="es-CO"/>
-        </w:rPr>
-        <w:t xml:space="preserve"> toma de decisiones</w:t>
-      </w:r>
-      <w:r>
-        <w:rPr>
-          <w:rFonts w:ascii="Cambria Math" w:hAnsi="Cambria Math" w:hint="eastAsia"/>
+        <w:t>datos → análisis → visualización → toma de decisiones</w:t>
+      </w:r>
+      <w:r>
+        <w:rPr>
+          <w:rFonts w:ascii="Cambria Math" w:hAnsi="Cambria Math"/>
           <w:sz w:val="18"/>
           <w:szCs w:val="18"/>
           <w:lang w:val="es-CO"/>
@@ -1350,8 +1284,8 @@
         <w:tblLook w:val="04A0" w:firstRow="1" w:lastRow="0" w:firstColumn="1" w:lastColumn="0" w:noHBand="0" w:noVBand="1"/>
       </w:tblPr>
       <w:tblGrid>
-        <w:gridCol w:w="2606"/>
-        <w:gridCol w:w="7842"/>
+        <w:gridCol w:w="2745"/>
+        <w:gridCol w:w="7703"/>
       </w:tblGrid>
       <w:tr>
         <w:trPr>
@@ -1432,16 +1366,16 @@
               <w:jc w:val="both"/>
               <w:rPr>
                 <w:rFonts w:ascii="Cambria Math" w:eastAsia="Times New Roman" w:hAnsi="Cambria Math" w:cs="Times New Roman"/>
-                <w:sz w:val="15"/>
-                <w:szCs w:val="15"/>
+                <w:sz w:val="18"/>
+                <w:szCs w:val="18"/>
                 <w:lang w:val="es-CO" w:eastAsia="es-ES_tradnl"/>
               </w:rPr>
             </w:pPr>
             <w:r>
               <w:rPr>
                 <w:rFonts w:ascii="Cambria Math" w:eastAsia="Times New Roman" w:hAnsi="Cambria Math" w:cs="Times New Roman"/>
-                <w:sz w:val="15"/>
-                <w:szCs w:val="15"/>
+                <w:sz w:val="18"/>
+                <w:szCs w:val="18"/>
                 <w:lang w:val="es-CO" w:eastAsia="es-ES_tradnl"/>
               </w:rPr>
               <w:t>1. Concentración de la contratación</w:t>
@@ -1460,16 +1394,16 @@
               <w:cnfStyle w:val="000000100000" w:firstRow="0" w:lastRow="0" w:firstColumn="0" w:lastColumn="0" w:oddVBand="0" w:evenVBand="0" w:oddHBand="1" w:evenHBand="0" w:firstRowFirstColumn="0" w:firstRowLastColumn="0" w:lastRowFirstColumn="0" w:lastRowLastColumn="0"/>
               <w:rPr>
                 <w:rFonts w:ascii="Cambria Math" w:eastAsia="Times New Roman" w:hAnsi="Cambria Math" w:cs="Times New Roman"/>
-                <w:sz w:val="15"/>
-                <w:szCs w:val="15"/>
+                <w:sz w:val="18"/>
+                <w:szCs w:val="18"/>
                 <w:lang w:val="es-CO" w:eastAsia="es-ES_tradnl"/>
               </w:rPr>
             </w:pPr>
             <w:r>
               <w:rPr>
                 <w:rFonts w:ascii="Cambria Math" w:eastAsia="Times New Roman" w:hAnsi="Cambria Math" w:cs="Times New Roman"/>
-                <w:sz w:val="15"/>
-                <w:szCs w:val="15"/>
+                <w:sz w:val="18"/>
+                <w:szCs w:val="18"/>
                 <w:lang w:val="es-CO" w:eastAsia="es-ES_tradnl"/>
               </w:rPr>
               <w:t>¿Cómo se concentra la contratación de INVIAS entre proveedores, modalidades y tipos de contrato?</w:t>
@@ -1493,16 +1427,16 @@
               <w:jc w:val="both"/>
               <w:rPr>
                 <w:rFonts w:ascii="Cambria Math" w:eastAsia="Times New Roman" w:hAnsi="Cambria Math" w:cs="Times New Roman"/>
-                <w:sz w:val="15"/>
-                <w:szCs w:val="15"/>
+                <w:sz w:val="18"/>
+                <w:szCs w:val="18"/>
                 <w:lang w:val="es-CO" w:eastAsia="es-ES_tradnl"/>
               </w:rPr>
             </w:pPr>
             <w:r>
               <w:rPr>
                 <w:rFonts w:ascii="Cambria Math" w:eastAsia="Times New Roman" w:hAnsi="Cambria Math" w:cs="Times New Roman"/>
-                <w:sz w:val="15"/>
-                <w:szCs w:val="15"/>
+                <w:sz w:val="18"/>
+                <w:szCs w:val="18"/>
                 <w:lang w:val="es-CO" w:eastAsia="es-ES_tradnl"/>
               </w:rPr>
               <w:t>2.</w:t>
@@ -1510,8 +1444,8 @@
             <w:r>
               <w:rPr>
                 <w:rFonts w:ascii="Cambria Math" w:eastAsia="Times New Roman" w:hAnsi="Cambria Math" w:cs="Times New Roman"/>
-                <w:sz w:val="15"/>
-                <w:szCs w:val="15"/>
+                <w:sz w:val="18"/>
+                <w:szCs w:val="18"/>
                 <w:lang w:val="es-CO" w:eastAsia="es-ES_tradnl"/>
               </w:rPr>
               <w:t xml:space="preserve"> </w:t>
@@ -1519,8 +1453,8 @@
             <w:r>
               <w:rPr>
                 <w:rFonts w:ascii="Cambria Math" w:eastAsia="Times New Roman" w:hAnsi="Cambria Math" w:cs="Times New Roman"/>
-                <w:sz w:val="15"/>
-                <w:szCs w:val="15"/>
+                <w:sz w:val="18"/>
+                <w:szCs w:val="18"/>
                 <w:lang w:val="es-CO" w:eastAsia="es-ES_tradnl"/>
               </w:rPr>
               <w:t>Distribución y trazabilidad territorial</w:t>
@@ -1539,16 +1473,16 @@
               <w:cnfStyle w:val="000000000000" w:firstRow="0" w:lastRow="0" w:firstColumn="0" w:lastColumn="0" w:oddVBand="0" w:evenVBand="0" w:oddHBand="0" w:evenHBand="0" w:firstRowFirstColumn="0" w:firstRowLastColumn="0" w:lastRowFirstColumn="0" w:lastRowLastColumn="0"/>
               <w:rPr>
                 <w:rFonts w:ascii="Cambria Math" w:eastAsia="Times New Roman" w:hAnsi="Cambria Math" w:cs="Times New Roman"/>
-                <w:sz w:val="15"/>
-                <w:szCs w:val="15"/>
+                <w:sz w:val="18"/>
+                <w:szCs w:val="18"/>
                 <w:lang w:val="es-CO" w:eastAsia="es-ES_tradnl"/>
               </w:rPr>
             </w:pPr>
             <w:r>
               <w:rPr>
                 <w:rFonts w:ascii="Cambria Math" w:eastAsia="Times New Roman" w:hAnsi="Cambria Math" w:cs="Times New Roman"/>
-                <w:sz w:val="15"/>
-                <w:szCs w:val="15"/>
+                <w:sz w:val="18"/>
+                <w:szCs w:val="18"/>
                 <w:lang w:val="es-CO" w:eastAsia="es-ES_tradnl"/>
               </w:rPr>
               <w:t>¿Dónde se concentran los recursos y qué nivel de trazabilidad territorial puede obtenerse a partir de la información disponible?</w:t>
@@ -1573,16 +1507,16 @@
               <w:jc w:val="both"/>
               <w:rPr>
                 <w:rFonts w:ascii="Cambria Math" w:eastAsia="Times New Roman" w:hAnsi="Cambria Math" w:cs="Times New Roman"/>
-                <w:sz w:val="15"/>
-                <w:szCs w:val="15"/>
+                <w:sz w:val="18"/>
+                <w:szCs w:val="18"/>
                 <w:lang w:val="es-CO" w:eastAsia="es-ES_tradnl"/>
               </w:rPr>
             </w:pPr>
             <w:r>
               <w:rPr>
                 <w:rFonts w:ascii="Cambria Math" w:eastAsia="Times New Roman" w:hAnsi="Cambria Math" w:cs="Times New Roman"/>
-                <w:sz w:val="15"/>
-                <w:szCs w:val="15"/>
+                <w:sz w:val="18"/>
+                <w:szCs w:val="18"/>
                 <w:lang w:val="es-CO" w:eastAsia="es-ES_tradnl"/>
               </w:rPr>
               <w:t>3. Ejecución financiera y modificaciones</w:t>
@@ -1601,16 +1535,16 @@
               <w:cnfStyle w:val="000000100000" w:firstRow="0" w:lastRow="0" w:firstColumn="0" w:lastColumn="0" w:oddVBand="0" w:evenVBand="0" w:oddHBand="1" w:evenHBand="0" w:firstRowFirstColumn="0" w:firstRowLastColumn="0" w:lastRowFirstColumn="0" w:lastRowLastColumn="0"/>
               <w:rPr>
                 <w:rFonts w:ascii="Cambria Math" w:eastAsia="Times New Roman" w:hAnsi="Cambria Math" w:cs="Times New Roman"/>
-                <w:sz w:val="15"/>
-                <w:szCs w:val="15"/>
+                <w:sz w:val="18"/>
+                <w:szCs w:val="18"/>
                 <w:lang w:val="es-CO" w:eastAsia="es-ES_tradnl"/>
               </w:rPr>
             </w:pPr>
             <w:r>
               <w:rPr>
                 <w:rFonts w:ascii="Cambria Math" w:eastAsia="Times New Roman" w:hAnsi="Cambria Math" w:cs="Times New Roman"/>
-                <w:sz w:val="15"/>
-                <w:szCs w:val="15"/>
+                <w:sz w:val="18"/>
+                <w:szCs w:val="18"/>
                 <w:lang w:val="es-CO" w:eastAsia="es-ES_tradnl"/>
               </w:rPr>
               <w:t>¿Cómo se comporta la ejecución financiera y cuáles contratos pueden requerir seguimiento por recursos pendientes o extensiones de plazo?</w:t>
@@ -1825,6 +1759,7 @@
                 <w:rFonts w:ascii="Cambria Math" w:hAnsi="Cambria Math"/>
                 <w:sz w:val="18"/>
                 <w:szCs w:val="18"/>
+                <w:lang w:val="es-CO"/>
               </w:rPr>
             </w:pPr>
           </w:p>
@@ -1902,6 +1837,161 @@
     </w:p>
     <w:p>
       <w:pPr>
+        <w:pStyle w:val="pdq2pgselectionanchorcontainer"/>
+        <w:rPr>
+          <w:rFonts w:ascii="Cambria Math" w:hAnsi="Cambria Math"/>
+          <w:sz w:val="18"/>
+          <w:szCs w:val="18"/>
+        </w:rPr>
+      </w:pPr>
+      <w:r>
+        <w:rPr>
+          <w:rFonts w:ascii="Cambria Math" w:hAnsi="Cambria Math"/>
+          <w:sz w:val="18"/>
+          <w:szCs w:val="18"/>
+        </w:rPr>
+        <w:t xml:space="preserve">Se analizaron </w:t>
+      </w:r>
+      <w:r>
+        <w:rPr>
+          <w:rStyle w:val="Fuerte"/>
+          <w:rFonts w:ascii="Cambria Math" w:hAnsi="Cambria Math"/>
+          <w:sz w:val="18"/>
+          <w:szCs w:val="18"/>
+        </w:rPr>
+        <w:t>17.477 contratos formalizados</w:t>
+      </w:r>
+      <w:r>
+        <w:rPr>
+          <w:rFonts w:ascii="Cambria Math" w:hAnsi="Cambria Math"/>
+          <w:sz w:val="18"/>
+          <w:szCs w:val="18"/>
+        </w:rPr>
+        <w:t xml:space="preserve">, de los cuales </w:t>
+      </w:r>
+      <w:r>
+        <w:rPr>
+          <w:rStyle w:val="Fuerte"/>
+          <w:rFonts w:ascii="Cambria Math" w:hAnsi="Cambria Math"/>
+          <w:sz w:val="18"/>
+          <w:szCs w:val="18"/>
+        </w:rPr>
+        <w:t>17.244 tuvieron valor positivo</w:t>
+      </w:r>
+      <w:r>
+        <w:rPr>
+          <w:rFonts w:ascii="Cambria Math" w:hAnsi="Cambria Math"/>
+          <w:sz w:val="18"/>
+          <w:szCs w:val="18"/>
+        </w:rPr>
+        <w:t xml:space="preserve">, considerando aproximadamente </w:t>
+      </w:r>
+      <w:r>
+        <w:rPr>
+          <w:rStyle w:val="Fuerte"/>
+          <w:rFonts w:ascii="Cambria Math" w:hAnsi="Cambria Math"/>
+          <w:sz w:val="18"/>
+          <w:szCs w:val="18"/>
+        </w:rPr>
+        <w:t>8.640 proveedores</w:t>
+      </w:r>
+      <w:r>
+        <w:rPr>
+          <w:rFonts w:ascii="Cambria Math" w:hAnsi="Cambria Math"/>
+          <w:sz w:val="18"/>
+          <w:szCs w:val="18"/>
+        </w:rPr>
+        <w:t xml:space="preserve"> para el análisis monetario. Se calcularon indicadores de concentración </w:t>
+      </w:r>
+      <w:r>
+        <w:rPr>
+          <w:rStyle w:val="Fuerte"/>
+          <w:rFonts w:ascii="Cambria Math" w:hAnsi="Cambria Math"/>
+          <w:sz w:val="18"/>
+          <w:szCs w:val="18"/>
+        </w:rPr>
+        <w:t>CR1, CR5, CR10 y HHI</w:t>
+      </w:r>
+      <w:r>
+        <w:rPr>
+          <w:rFonts w:ascii="Cambria Math" w:hAnsi="Cambria Math"/>
+          <w:sz w:val="18"/>
+          <w:szCs w:val="18"/>
+        </w:rPr>
+        <w:t>, y se comparó la participación en número de contratos frente al valor contratado por modalidad y tipo contractual.</w:t>
+      </w:r>
+    </w:p>
+    <w:p>
+      <w:pPr>
+        <w:pStyle w:val="Ttulo2"/>
+        <w:jc w:val="both"/>
+        <w:rPr>
+          <w:rFonts w:ascii="Cambria Math" w:hAnsi="Cambria Math"/>
+          <w:sz w:val="18"/>
+          <w:szCs w:val="18"/>
+          <w:lang w:val="es-CO"/>
+        </w:rPr>
+      </w:pPr>
+      <w:r>
+        <w:rPr>
+          <w:rFonts w:ascii="Cambria Math" w:hAnsi="Cambria Math"/>
+          <w:sz w:val="18"/>
+          <w:szCs w:val="18"/>
+          <w:lang w:val="es-CO"/>
+        </w:rPr>
+        <w:t>1.3 Hallazgos principales</w:t>
+      </w:r>
+    </w:p>
+    <w:p>
+      <w:pPr>
+        <w:pStyle w:val="Ttulo2"/>
+        <w:jc w:val="both"/>
+        <w:rPr>
+          <w:rFonts w:ascii="Cambria Math" w:eastAsiaTheme="minorEastAsia" w:hAnsi="Cambria Math" w:cstheme="minorBidi"/>
+          <w:b w:val="0"/>
+          <w:bCs w:val="0"/>
+          <w:color w:val="auto"/>
+          <w:sz w:val="18"/>
+          <w:szCs w:val="18"/>
+          <w:lang w:val="es-CO"/>
+        </w:rPr>
+      </w:pPr>
+      <w:r>
+        <w:rPr>
+          <w:rFonts w:ascii="Cambria Math" w:eastAsiaTheme="minorEastAsia" w:hAnsi="Cambria Math" w:cstheme="minorBidi"/>
+          <w:b w:val="0"/>
+          <w:bCs w:val="0"/>
+          <w:color w:val="auto"/>
+          <w:sz w:val="18"/>
+          <w:szCs w:val="18"/>
+          <w:lang w:val="es-CO"/>
+        </w:rPr>
+        <w:t>La concentración por proveedor es baja: el principal concentra 4,54 %, los cinco principales 12,79 % y los diez principales 20,38 % del valor; el HHI ≈ 85. No obstante, 216 proveedores (≈2,5 %) concentran el 80 % del valor contratado. Por tipo contractual, Obra representa 15,4 % de los contratos pero 66,3 % del valor, mientras que Prestación de Servicios representa 58,7 % de los contratos y solo 3,3 % del valor.</w:t>
+      </w:r>
+    </w:p>
+    <w:p>
+      <w:pPr>
+        <w:pStyle w:val="Ttulo2"/>
+        <w:jc w:val="both"/>
+        <w:rPr>
+          <w:rFonts w:ascii="Cambria Math" w:hAnsi="Cambria Math"/>
+          <w:sz w:val="18"/>
+          <w:szCs w:val="18"/>
+          <w:lang w:val="es-CO"/>
+        </w:rPr>
+      </w:pPr>
+      <w:r>
+        <w:rPr>
+          <w:rFonts w:ascii="Cambria Math" w:hAnsi="Cambria Math"/>
+          <w:sz w:val="18"/>
+          <w:szCs w:val="18"/>
+          <w:lang w:val="es-CO"/>
+        </w:rPr>
+        <w:t>1.4 Respuesta a la pregunta de negocio</w:t>
+      </w:r>
+    </w:p>
+    <w:p>
+      <w:pPr>
         <w:spacing w:after="80"/>
         <w:jc w:val="both"/>
         <w:rPr>
@@ -1911,18 +2001,77 @@
           <w:lang w:val="es-CO"/>
         </w:rPr>
       </w:pPr>
-      <w:r>
-        <w:rPr>
-          <w:rFonts w:ascii="Cambria Math" w:hAnsi="Cambria Math"/>
-          <w:sz w:val="18"/>
-          <w:szCs w:val="18"/>
-          <w:lang w:val="es-CO"/>
-        </w:rPr>
-        <w:t>[Completar esta sección con información breve, cuantitativa y directamente relacionada con la pregunta.]</w:t>
-      </w:r>
     </w:p>
     <w:p>
       <w:pPr>
+        <w:spacing w:after="80"/>
+        <w:jc w:val="both"/>
+        <w:rPr>
+          <w:rFonts w:ascii="Cambria Math" w:hAnsi="Cambria Math"/>
+          <w:sz w:val="18"/>
+          <w:szCs w:val="18"/>
+          <w:lang w:val="es-CO"/>
+        </w:rPr>
+      </w:pPr>
+      <w:r>
+        <w:rPr>
+          <w:rFonts w:ascii="Cambria Math" w:hAnsi="Cambria Math"/>
+          <w:sz w:val="18"/>
+          <w:szCs w:val="18"/>
+          <w:lang w:val="es-CO"/>
+        </w:rPr>
+        <w:t xml:space="preserve">No se observa una concentración dominante en pocos proveedores. Sin embargo, existe </w:t>
+      </w:r>
+      <w:r>
+        <w:rPr>
+          <w:rStyle w:val="Fuerte"/>
+          <w:rFonts w:ascii="Cambria Math" w:hAnsi="Cambria Math"/>
+          <w:sz w:val="18"/>
+          <w:szCs w:val="18"/>
+          <w:lang w:val="es-CO"/>
+        </w:rPr>
+        <w:t>desigualdad en la distribución del valor</w:t>
+      </w:r>
+      <w:r>
+        <w:rPr>
+          <w:rFonts w:ascii="Cambria Math" w:hAnsi="Cambria Math"/>
+          <w:sz w:val="18"/>
+          <w:szCs w:val="18"/>
+          <w:lang w:val="es-CO"/>
+        </w:rPr>
+        <w:t xml:space="preserve"> y una concentración económica importante en determinados tipos y modalidades contractuales. Por ello, el análisis debe considerar simultáneamente </w:t>
+      </w:r>
+      <w:r>
+        <w:rPr>
+          <w:rStyle w:val="Fuerte"/>
+          <w:rFonts w:ascii="Cambria Math" w:hAnsi="Cambria Math"/>
+          <w:sz w:val="18"/>
+          <w:szCs w:val="18"/>
+          <w:lang w:val="es-CO"/>
+        </w:rPr>
+        <w:t>proveedor, modalidad y tipo de contrato</w:t>
+      </w:r>
+      <w:r>
+        <w:rPr>
+          <w:rFonts w:ascii="Cambria Math" w:hAnsi="Cambria Math"/>
+          <w:sz w:val="18"/>
+          <w:szCs w:val="18"/>
+          <w:lang w:val="es-CO"/>
+        </w:rPr>
+        <w:t>.</w:t>
+      </w:r>
+      <w:r>
+        <w:rPr>
+          <w:rFonts w:ascii="Cambria Math" w:hAnsi="Cambria Math"/>
+          <w:sz w:val="18"/>
+          <w:szCs w:val="18"/>
+          <w:lang w:val="es-CO"/>
+        </w:rPr>
+        <w:t xml:space="preserve"> </w:t>
+      </w:r>
+    </w:p>
+    <w:p>
+      <w:pPr>
         <w:pStyle w:val="Ttulo2"/>
         <w:jc w:val="both"/>
         <w:rPr>
@@ -1939,12 +2088,11 @@
           <w:szCs w:val="18"/>
           <w:lang w:val="es-CO"/>
         </w:rPr>
-        <w:t>1.3 Hallazgos principales</w:t>
+        <w:t>1.5 Implicación para la toma de decisiones</w:t>
       </w:r>
     </w:p>
     <w:p>
       <w:pPr>
-        <w:spacing w:after="80"/>
         <w:jc w:val="both"/>
         <w:rPr>
           <w:rFonts w:ascii="Cambria Math" w:hAnsi="Cambria Math"/>
@@ -1953,19 +2101,9 @@
           <w:lang w:val="es-CO"/>
         </w:rPr>
       </w:pPr>
-      <w:r>
-        <w:rPr>
-          <w:rFonts w:ascii="Cambria Math" w:hAnsi="Cambria Math"/>
-          <w:sz w:val="18"/>
-          <w:szCs w:val="18"/>
-          <w:lang w:val="es-CO"/>
-        </w:rPr>
-        <w:t>[Completar esta sección con información breve, cuantitativa y directamente relacionada con la pregunta.]</w:t>
-      </w:r>
     </w:p>
     <w:p>
       <w:pPr>
-        <w:pStyle w:val="Ttulo2"/>
         <w:jc w:val="both"/>
         <w:rPr>
           <w:rFonts w:ascii="Cambria Math" w:hAnsi="Cambria Math"/>
@@ -1981,12 +2119,49 @@
           <w:szCs w:val="18"/>
           <w:lang w:val="es-CO"/>
         </w:rPr>
-        <w:t>1.4 Respuesta a la pregunta de negocio</w:t>
+        <w:t xml:space="preserve">Los resultados permiten </w:t>
+      </w:r>
+      <w:r>
+        <w:rPr>
+          <w:rStyle w:val="Fuerte"/>
+          <w:rFonts w:ascii="Cambria Math" w:hAnsi="Cambria Math"/>
+          <w:sz w:val="18"/>
+          <w:szCs w:val="18"/>
+          <w:lang w:val="es-CO"/>
+        </w:rPr>
+        <w:t>focalizar el seguimiento</w:t>
+      </w:r>
+      <w:r>
+        <w:rPr>
+          <w:rFonts w:ascii="Cambria Math" w:hAnsi="Cambria Math"/>
+          <w:sz w:val="18"/>
+          <w:szCs w:val="18"/>
+          <w:lang w:val="es-CO"/>
+        </w:rPr>
+        <w:t xml:space="preserve"> en segmentos con mayor concentración económica y utilizar los indicadores como señales para análisis posterior. Estos resultados </w:t>
+      </w:r>
+      <w:r>
+        <w:rPr>
+          <w:rStyle w:val="Fuerte"/>
+          <w:rFonts w:ascii="Cambria Math" w:hAnsi="Cambria Math"/>
+          <w:sz w:val="18"/>
+          <w:szCs w:val="18"/>
+          <w:lang w:val="es-CO"/>
+        </w:rPr>
+        <w:t>no constituyen por sí solos evidencia de irregularidad</w:t>
+      </w:r>
+      <w:r>
+        <w:rPr>
+          <w:rFonts w:ascii="Cambria Math" w:hAnsi="Cambria Math"/>
+          <w:sz w:val="18"/>
+          <w:szCs w:val="18"/>
+          <w:lang w:val="es-CO"/>
+        </w:rPr>
+        <w:t>.</w:t>
       </w:r>
     </w:p>
     <w:p>
       <w:pPr>
-        <w:spacing w:after="80"/>
         <w:jc w:val="both"/>
         <w:rPr>
           <w:rFonts w:ascii="Cambria Math" w:hAnsi="Cambria Math"/>
@@ -1995,89 +2170,103 @@
           <w:lang w:val="es-CO"/>
         </w:rPr>
       </w:pPr>
-      <w:r>
-        <w:rPr>
-          <w:rFonts w:ascii="Cambria Math" w:hAnsi="Cambria Math"/>
-          <w:sz w:val="18"/>
-          <w:szCs w:val="18"/>
-          <w:lang w:val="es-CO"/>
-        </w:rPr>
-        <w:t>[Completar esta sección con información breve, cuantitativa y directamente relacionada con la pregunta.]</w:t>
-      </w:r>
     </w:p>
     <w:p>
       <w:pPr>
-        <w:pStyle w:val="Ttulo2"/>
-        <w:jc w:val="both"/>
-        <w:rPr>
-          <w:rFonts w:ascii="Cambria Math" w:hAnsi="Cambria Math"/>
-          <w:sz w:val="18"/>
-          <w:szCs w:val="18"/>
-          <w:lang w:val="es-CO"/>
-        </w:rPr>
-      </w:pPr>
-      <w:r>
-        <w:rPr>
-          <w:rFonts w:ascii="Cambria Math" w:hAnsi="Cambria Math"/>
-          <w:sz w:val="18"/>
-          <w:szCs w:val="18"/>
-          <w:lang w:val="es-CO"/>
-        </w:rPr>
-        <w:t>1.5 Implicación para la toma de decisiones</w:t>
-      </w:r>
-    </w:p>
-    <w:p>
-      <w:pPr>
-        <w:spacing w:after="80"/>
-        <w:jc w:val="both"/>
-        <w:rPr>
-          <w:rFonts w:ascii="Cambria Math" w:hAnsi="Cambria Math"/>
-          <w:sz w:val="18"/>
-          <w:szCs w:val="18"/>
-          <w:lang w:val="es-CO"/>
-        </w:rPr>
-      </w:pPr>
-      <w:r>
-        <w:rPr>
-          <w:rFonts w:ascii="Cambria Math" w:hAnsi="Cambria Math"/>
-          <w:sz w:val="18"/>
-          <w:szCs w:val="18"/>
-          <w:lang w:val="es-CO"/>
-        </w:rPr>
-        <w:t>[Completar esta sección con información breve, cuantitativa y directamente relacionada con la pregunta.]</w:t>
-      </w:r>
-    </w:p>
-    <w:p>
-      <w:pPr>
-        <w:jc w:val="both"/>
-        <w:rPr>
-          <w:rFonts w:ascii="Cambria Math" w:hAnsi="Cambria Math"/>
-          <w:sz w:val="18"/>
-          <w:szCs w:val="18"/>
-          <w:lang w:val="es-CO"/>
-        </w:rPr>
-      </w:pPr>
-      <w:r>
-        <w:rPr>
-          <w:rFonts w:ascii="Cambria Math" w:hAnsi="Cambria Math"/>
-          <w:i/>
-          <w:sz w:val="18"/>
-          <w:szCs w:val="18"/>
-          <w:lang w:val="es-CO"/>
-        </w:rPr>
-        <w:t>Visualizaciones/evidencias: [Insertar máximo 1–2 elementos gráficos relevantes.]</w:t>
-      </w:r>
-    </w:p>
-    <w:p>
-      <w:pPr>
-        <w:jc w:val="both"/>
-        <w:rPr>
-          <w:rFonts w:ascii="Cambria Math" w:hAnsi="Cambria Math"/>
-          <w:sz w:val="18"/>
-          <w:szCs w:val="18"/>
-          <w:lang w:val="es-CO"/>
-        </w:rPr>
-      </w:pPr>
+        <w:jc w:val="center"/>
+        <w:rPr>
+          <w:rFonts w:ascii="Cambria Math" w:hAnsi="Cambria Math"/>
+          <w:sz w:val="18"/>
+          <w:szCs w:val="18"/>
+          <w:lang w:val="es-CO"/>
+        </w:rPr>
+      </w:pPr>
+      <w:r>
+        <w:rPr>
+          <w:rFonts w:ascii="Cambria Math" w:hAnsi="Cambria Math"/>
+          <w:sz w:val="18"/>
+          <w:szCs w:val="18"/>
+        </w:rPr>
+        <w:drawing>
+          <wp:inline distT="0" distB="0" distL="0" distR="0" wp14:anchorId="2364C062" wp14:editId="55FE8374">
+            <wp:extent cx="4830233" cy="2362876"/>
+            <wp:effectExtent l="114300" t="101600" r="123190" b="139065"/>
+            <wp:docPr id="13" name="Imagen 12">
+              <a:extLst xmlns:a="http://schemas.openxmlformats.org/drawingml/2006/main">
+                <a:ext uri="{FF2B5EF4-FFF2-40B4-BE49-F238E27FC236}">
+                  <a16:creationId xmlns:a16="http://schemas.microsoft.com/office/drawing/2014/main" id="{038A5DD4-2999-768C-C07A-AE60D3567394}"/>
+                </a:ext>
+              </a:extLst>
+            </wp:docPr>
+            <wp:cNvGraphicFramePr>
+              <a:graphicFrameLocks xmlns:a="http://schemas.openxmlformats.org/drawingml/2006/main" noChangeAspect="1"/>
+            </wp:cNvGraphicFramePr>
+            <a:graphic xmlns:a="http://schemas.openxmlformats.org/drawingml/2006/main">
+              <a:graphicData uri="http://schemas.openxmlformats.org/drawingml/2006/picture">
+                <pic:pic xmlns:pic="http://schemas.openxmlformats.org/drawingml/2006/picture">
+                  <pic:nvPicPr>
+                    <pic:cNvPr id="13" name="Imagen 12">
+                      <a:extLst>
+                        <a:ext uri="{FF2B5EF4-FFF2-40B4-BE49-F238E27FC236}">
+                          <a16:creationId xmlns:a16="http://schemas.microsoft.com/office/drawing/2014/main" id="{038A5DD4-2999-768C-C07A-AE60D3567394}"/>
+                        </a:ext>
+                      </a:extLst>
+                    </pic:cNvPr>
+                    <pic:cNvPicPr>
+                      <a:picLocks noChangeAspect="1"/>
+                    </pic:cNvPicPr>
+                  </pic:nvPicPr>
+                  <pic:blipFill>
+                    <a:blip r:embed="rId9"/>
+                    <a:stretch>
+                      <a:fillRect/>
+                    </a:stretch>
+                  </pic:blipFill>
+                  <pic:spPr>
+                    <a:xfrm>
+                      <a:off x="0" y="0"/>
+                      <a:ext cx="4844863" cy="2370033"/>
+                    </a:xfrm>
+                    <a:prstGeom prst="rect">
+                      <a:avLst/>
+                    </a:prstGeom>
+                    <a:solidFill>
+                      <a:srgbClr val="FFFFFF">
+                        <a:shade val="85000"/>
+                      </a:srgbClr>
+                    </a:solidFill>
+                    <a:ln w="88900" cap="sq">
+                      <a:solidFill>
+                        <a:srgbClr val="FFFFFF"/>
+                      </a:solidFill>
+                      <a:miter lim="800000"/>
+                    </a:ln>
+                    <a:effectLst>
+                      <a:outerShdw blurRad="55000" dist="18000" dir="5400000" algn="tl" rotWithShape="0">
+                        <a:srgbClr val="000000">
+                          <a:alpha val="40000"/>
+                        </a:srgbClr>
+                      </a:outerShdw>
+                    </a:effectLst>
+                    <a:scene3d>
+                      <a:camera prst="orthographicFront"/>
+                      <a:lightRig rig="twoPt" dir="t">
+                        <a:rot lat="0" lon="0" rev="7200000"/>
+                      </a:lightRig>
+                    </a:scene3d>
+                    <a:sp3d>
+                      <a:bevelT w="25400" h="19050"/>
+                      <a:contourClr>
+                        <a:srgbClr val="FFFFFF"/>
+                      </a:contourClr>
+                    </a:sp3d>
+                  </pic:spPr>
+                </pic:pic>
+              </a:graphicData>
+            </a:graphic>
+          </wp:inline>
+        </w:drawing>
+      </w:r>
       <w:r>
         <w:rPr>
           <w:rFonts w:ascii="Cambria Math" w:hAnsi="Cambria Math"/>
@@ -2263,6 +2452,7 @@
                 <w:rFonts w:ascii="Cambria Math" w:hAnsi="Cambria Math"/>
                 <w:sz w:val="18"/>
                 <w:szCs w:val="18"/>
+                <w:lang w:val="es-CO"/>
               </w:rPr>
             </w:pPr>
           </w:p>
@@ -2314,19 +2504,7 @@
           <w:szCs w:val="18"/>
           <w:lang w:val="es-CO"/>
         </w:rPr>
-        <w:t>¿Dónde ejecuta INVIAS sus recursos? Dado que el SECOP II no registra el lugar de ejecución del contrato, ¿qué proporción de la contratación de la entidad es territorialmente identificable a partir del objeto contractual, y cómo se distribuyen y evolucionan en el territorio los recursos que sí lo son?</w:t>
-      </w:r>
-      <w:r>
-        <w:rPr>
-          <w:rFonts w:ascii="Cambria Math" w:eastAsiaTheme="minorEastAsia" w:hAnsi="Cambria Math" w:cstheme="minorBidi"/>
-          <w:b w:val="0"/>
-          <w:bCs w:val="0"/>
-          <w:color w:val="auto"/>
-          <w:sz w:val="18"/>
-          <w:szCs w:val="18"/>
-          <w:lang w:val="es-CO"/>
-        </w:rPr>
-        <w:t xml:space="preserve"> </w:t>
+        <w:t xml:space="preserve">¿Dónde ejecuta INVIAS sus recursos? Dado que el SECOP II no registra el lugar de ejecución del contrato, ¿qué proporción de la contratación de la entidad es territorialmente identificable a partir del objeto contractual, y cómo se distribuyen y evolucionan en el territorio los recursos que sí lo son? </w:t>
       </w:r>
     </w:p>
     <w:p>
@@ -2421,7 +2599,6 @@
       <w:r>
         <w:rPr>
           <w:rFonts w:ascii="Cambria Math" w:eastAsia="Times New Roman" w:hAnsi="Cambria Math" w:cs="Times New Roman"/>
-          <w:b w:val="0"/>
           <w:sz w:val="18"/>
           <w:szCs w:val="18"/>
           <w:lang w:val="es-CO" w:eastAsia="es-ES_tradnl"/>
@@ -2458,7 +2635,6 @@
       <w:r>
         <w:rPr>
           <w:rFonts w:ascii="Cambria Math" w:eastAsia="Times New Roman" w:hAnsi="Cambria Math" w:cs="Times New Roman"/>
-          <w:b w:val="0"/>
           <w:sz w:val="18"/>
           <w:szCs w:val="18"/>
           <w:lang w:val="es-CO" w:eastAsia="es-ES_tradnl"/>
@@ -2495,7 +2671,6 @@
       <w:r>
         <w:rPr>
           <w:rFonts w:ascii="Cambria Math" w:eastAsia="Times New Roman" w:hAnsi="Cambria Math" w:cs="Times New Roman"/>
-          <w:b w:val="0"/>
           <w:sz w:val="18"/>
           <w:szCs w:val="18"/>
           <w:lang w:val="es-CO" w:eastAsia="es-ES_tradnl"/>
@@ -2532,7 +2707,6 @@
       <w:r>
         <w:rPr>
           <w:rFonts w:ascii="Cambria Math" w:eastAsia="Times New Roman" w:hAnsi="Cambria Math" w:cs="Times New Roman"/>
-          <w:b w:val="0"/>
           <w:sz w:val="18"/>
           <w:szCs w:val="18"/>
           <w:lang w:val="es-CO" w:eastAsia="es-ES_tradnl"/>
@@ -2647,48 +2821,55 @@
     </w:p>
     <w:tbl>
       <w:tblPr>
-        <w:tblW w:type="auto" w:w="0"/>
-        <w:tblLook w:firstColumn="1" w:firstRow="1" w:lastColumn="0" w:lastRow="0" w:noHBand="0" w:noVBand="1" w:val="04A0"/>
+        <w:tblW w:w="0" w:type="auto"/>
         <w:jc w:val="center"/>
-        <w:tblBorders>
-          <w:top w:val="none" w:sz="0"/>
-          <w:left w:val="none" w:sz="0"/>
-          <w:bottom w:val="none" w:sz="0"/>
-          <w:right w:val="none" w:sz="0"/>
-          <w:insideH w:val="none" w:sz="0"/>
-          <w:insideV w:val="none" w:sz="0"/>
-        </w:tblBorders>
+        <w:tblLook w:val="04A0" w:firstRow="1" w:lastRow="0" w:firstColumn="1" w:lastColumn="0" w:noHBand="0" w:noVBand="1"/>
       </w:tblPr>
       <w:tblGrid>
         <w:gridCol w:w="3402"/>
         <w:gridCol w:w="5953"/>
       </w:tblGrid>
       <w:tr>
+        <w:trPr>
+          <w:jc w:val="center"/>
+        </w:trPr>
         <w:tc>
           <w:tcPr>
-            <w:tcW w:type="dxa" w:w="3402"/>
+            <w:tcW w:w="3402" w:type="dxa"/>
           </w:tcPr>
           <w:p>
             <w:pPr>
               <w:jc w:val="center"/>
+              <w:rPr>
+                <w:rFonts w:ascii="Cambria Math" w:hAnsi="Cambria Math"/>
+                <w:sz w:val="18"/>
+                <w:szCs w:val="18"/>
+              </w:rPr>
             </w:pPr>
             <w:r>
+              <w:rPr>
+                <w:rFonts w:ascii="Cambria Math" w:hAnsi="Cambria Math"/>
+                <w:noProof/>
+                <w:sz w:val="18"/>
+                <w:szCs w:val="18"/>
+              </w:rPr>
               <w:drawing>
-                <wp:inline xmlns:a="http://schemas.openxmlformats.org/drawingml/2006/main" xmlns:pic="http://schemas.openxmlformats.org/drawingml/2006/picture">
+                <wp:inline distT="0" distB="0" distL="0" distR="0" wp14:anchorId="55941D08" wp14:editId="2E2A9D64">
                   <wp:extent cx="1296000" cy="1752597"/>
+                  <wp:effectExtent l="0" t="0" r="0" b="0"/>
                   <wp:docPr id="34738623" name="Picture 34738623"/>
                   <wp:cNvGraphicFramePr>
-                    <a:graphicFrameLocks noChangeAspect="1"/>
+                    <a:graphicFrameLocks xmlns:a="http://schemas.openxmlformats.org/drawingml/2006/main" noChangeAspect="1"/>
                   </wp:cNvGraphicFramePr>
-                  <a:graphic>
+                  <a:graphic xmlns:a="http://schemas.openxmlformats.org/drawingml/2006/main">
                     <a:graphicData uri="http://schemas.openxmlformats.org/drawingml/2006/picture">
-                      <pic:pic>
+                      <pic:pic xmlns:pic="http://schemas.openxmlformats.org/drawingml/2006/picture">
                         <pic:nvPicPr>
                           <pic:cNvPr id="0" name="fig06_cell29.png"/>
                           <pic:cNvPicPr/>
                         </pic:nvPicPr>
                         <pic:blipFill>
-                          <a:blip r:embed="rId12"/>
+                          <a:blip r:embed="rId10"/>
                           <a:stretch>
                             <a:fillRect/>
                           </a:stretch>
@@ -2698,7 +2879,9 @@
                             <a:off x="0" y="0"/>
                             <a:ext cx="1296000" cy="1752597"/>
                           </a:xfrm>
-                          <a:prstGeom prst="rect"/>
+                          <a:prstGeom prst="rect">
+                            <a:avLst/>
+                          </a:prstGeom>
                         </pic:spPr>
                       </pic:pic>
                     </a:graphicData>
@@ -2710,12 +2893,18 @@
           <w:p>
             <w:pPr>
               <w:jc w:val="center"/>
+              <w:rPr>
+                <w:rFonts w:ascii="Cambria Math" w:hAnsi="Cambria Math"/>
+                <w:sz w:val="18"/>
+                <w:szCs w:val="18"/>
+              </w:rPr>
             </w:pPr>
             <w:r>
               <w:rPr>
                 <w:rFonts w:ascii="Cambria Math" w:hAnsi="Cambria Math"/>
                 <w:i/>
                 <w:sz w:val="18"/>
+                <w:szCs w:val="18"/>
               </w:rPr>
               <w:t>Valor contratado por departamento.</w:t>
             </w:r>
@@ -2723,29 +2912,41 @@
         </w:tc>
         <w:tc>
           <w:tcPr>
-            <w:tcW w:type="dxa" w:w="5953"/>
+            <w:tcW w:w="5953" w:type="dxa"/>
           </w:tcPr>
           <w:p>
             <w:pPr>
               <w:jc w:val="center"/>
+              <w:rPr>
+                <w:rFonts w:ascii="Cambria Math" w:hAnsi="Cambria Math"/>
+                <w:sz w:val="18"/>
+                <w:szCs w:val="18"/>
+              </w:rPr>
             </w:pPr>
             <w:r>
+              <w:rPr>
+                <w:rFonts w:ascii="Cambria Math" w:hAnsi="Cambria Math"/>
+                <w:noProof/>
+                <w:sz w:val="18"/>
+                <w:szCs w:val="18"/>
+              </w:rPr>
               <w:drawing>
-                <wp:inline xmlns:a="http://schemas.openxmlformats.org/drawingml/2006/main" xmlns:pic="http://schemas.openxmlformats.org/drawingml/2006/picture">
+                <wp:inline distT="0" distB="0" distL="0" distR="0" wp14:anchorId="33E4C4DE" wp14:editId="6A6153AF">
                   <wp:extent cx="3240000" cy="1301690"/>
+                  <wp:effectExtent l="0" t="0" r="0" b="0"/>
                   <wp:docPr id="34738624" name="Picture 34738624"/>
                   <wp:cNvGraphicFramePr>
-                    <a:graphicFrameLocks noChangeAspect="1"/>
+                    <a:graphicFrameLocks xmlns:a="http://schemas.openxmlformats.org/drawingml/2006/main" noChangeAspect="1"/>
                   </wp:cNvGraphicFramePr>
-                  <a:graphic>
+                  <a:graphic xmlns:a="http://schemas.openxmlformats.org/drawingml/2006/main">
                     <a:graphicData uri="http://schemas.openxmlformats.org/drawingml/2006/picture">
-                      <pic:pic>
+                      <pic:pic xmlns:pic="http://schemas.openxmlformats.org/drawingml/2006/picture">
                         <pic:nvPicPr>
                           <pic:cNvPr id="0" name="fig03_cell18.png"/>
                           <pic:cNvPicPr/>
                         </pic:nvPicPr>
                         <pic:blipFill>
-                          <a:blip r:embed="rId13"/>
+                          <a:blip r:embed="rId11"/>
                           <a:stretch>
                             <a:fillRect/>
                           </a:stretch>
@@ -2755,7 +2956,9 @@
                             <a:off x="0" y="0"/>
                             <a:ext cx="3240000" cy="1301690"/>
                           </a:xfrm>
-                          <a:prstGeom prst="rect"/>
+                          <a:prstGeom prst="rect">
+                            <a:avLst/>
+                          </a:prstGeom>
                         </pic:spPr>
                       </pic:pic>
                     </a:graphicData>
@@ -2767,12 +2970,18 @@
           <w:p>
             <w:pPr>
               <w:jc w:val="center"/>
+              <w:rPr>
+                <w:rFonts w:ascii="Cambria Math" w:hAnsi="Cambria Math"/>
+                <w:sz w:val="18"/>
+                <w:szCs w:val="18"/>
+              </w:rPr>
             </w:pPr>
             <w:r>
               <w:rPr>
                 <w:rFonts w:ascii="Cambria Math" w:hAnsi="Cambria Math"/>
                 <w:i/>
                 <w:sz w:val="18"/>
+                <w:szCs w:val="18"/>
               </w:rPr>
               <w:t>Trazabilidad territorial por año.</w:t>
             </w:r>
@@ -2807,16 +3016,16 @@
         <w:jc w:val="both"/>
         <w:rPr>
           <w:rFonts w:ascii="Cambria Math" w:hAnsi="Cambria Math"/>
-          <w:sz w:val="18"/>
-          <w:szCs w:val="18"/>
-          <w:lang w:val="es-CO"/>
-        </w:rPr>
-      </w:pPr>
-      <w:r>
-        <w:rPr>
-          <w:rFonts w:ascii="Cambria Math" w:hAnsi="Cambria Math"/>
-          <w:sz w:val="18"/>
-          <w:szCs w:val="18"/>
+          <w:sz w:val="16"/>
+          <w:szCs w:val="16"/>
+          <w:lang w:val="es-CO"/>
+        </w:rPr>
+      </w:pPr>
+      <w:r>
+        <w:rPr>
+          <w:rFonts w:ascii="Cambria Math" w:hAnsi="Cambria Math"/>
+          <w:sz w:val="16"/>
+          <w:szCs w:val="16"/>
           <w:lang w:val="es-CO"/>
         </w:rPr>
         <w:lastRenderedPageBreak/>
@@ -2849,8 +3058,8 @@
               <w:rPr>
                 <w:rFonts w:ascii="Cambria Math" w:hAnsi="Cambria Math"/>
                 <w:bCs/>
-                <w:sz w:val="18"/>
-                <w:szCs w:val="18"/>
+                <w:sz w:val="16"/>
+                <w:szCs w:val="16"/>
                 <w:lang w:val="es-CO"/>
               </w:rPr>
             </w:pPr>
@@ -2858,8 +3067,8 @@
               <w:rPr>
                 <w:rFonts w:ascii="Cambria Math" w:hAnsi="Cambria Math"/>
                 <w:b/>
-                <w:sz w:val="18"/>
-                <w:szCs w:val="18"/>
+                <w:sz w:val="16"/>
+                <w:szCs w:val="16"/>
                 <w:lang w:val="es-CO"/>
               </w:rPr>
               <w:t>Rol</w:t>
@@ -2868,8 +3077,8 @@
               <w:rPr>
                 <w:rFonts w:ascii="Cambria Math" w:hAnsi="Cambria Math"/>
                 <w:b/>
-                <w:sz w:val="18"/>
-                <w:szCs w:val="18"/>
+                <w:sz w:val="16"/>
+                <w:szCs w:val="16"/>
                 <w:lang w:val="es-CO"/>
               </w:rPr>
               <w:t>:</w:t>
@@ -2878,8 +3087,8 @@
               <w:rPr>
                 <w:rFonts w:ascii="Cambria Math" w:hAnsi="Cambria Math"/>
                 <w:bCs/>
-                <w:sz w:val="18"/>
-                <w:szCs w:val="18"/>
+                <w:sz w:val="16"/>
+                <w:szCs w:val="16"/>
                 <w:lang w:val="es-CO"/>
               </w:rPr>
               <w:t xml:space="preserve"> </w:t>
@@ -2887,8 +3096,8 @@
             <w:r>
               <w:rPr>
                 <w:rFonts w:ascii="Cambria Math" w:hAnsi="Cambria Math"/>
-                <w:sz w:val="18"/>
-                <w:szCs w:val="18"/>
+                <w:sz w:val="16"/>
+                <w:szCs w:val="16"/>
                 <w:lang w:val="es-CO"/>
               </w:rPr>
               <w:t>Análisis de negocio + Análisis de datos</w:t>
@@ -2905,8 +3114,8 @@
               <w:jc w:val="both"/>
               <w:rPr>
                 <w:rFonts w:ascii="Cambria Math" w:hAnsi="Cambria Math"/>
-                <w:sz w:val="18"/>
-                <w:szCs w:val="18"/>
+                <w:sz w:val="16"/>
+                <w:szCs w:val="16"/>
                 <w:lang w:val="es-CO"/>
               </w:rPr>
             </w:pPr>
@@ -2929,16 +3138,16 @@
               <w:rPr>
                 <w:rFonts w:ascii="Cambria Math" w:hAnsi="Cambria Math"/>
                 <w:bCs/>
-                <w:sz w:val="18"/>
-                <w:szCs w:val="18"/>
+                <w:sz w:val="16"/>
+                <w:szCs w:val="16"/>
               </w:rPr>
             </w:pPr>
             <w:r>
               <w:rPr>
                 <w:rFonts w:ascii="Cambria Math" w:hAnsi="Cambria Math"/>
                 <w:b/>
-                <w:sz w:val="18"/>
-                <w:szCs w:val="18"/>
+                <w:sz w:val="16"/>
+                <w:szCs w:val="16"/>
               </w:rPr>
               <w:t>Responsable(s)</w:t>
             </w:r>
@@ -2946,16 +3155,16 @@
               <w:rPr>
                 <w:rFonts w:ascii="Cambria Math" w:hAnsi="Cambria Math"/>
                 <w:b/>
-                <w:sz w:val="18"/>
-                <w:szCs w:val="18"/>
+                <w:sz w:val="16"/>
+                <w:szCs w:val="16"/>
               </w:rPr>
               <w:t xml:space="preserve">: </w:t>
             </w:r>
             <w:r>
               <w:rPr>
                 <w:rFonts w:ascii="Cambria Math" w:hAnsi="Cambria Math"/>
-                <w:sz w:val="18"/>
-                <w:szCs w:val="18"/>
+                <w:sz w:val="16"/>
+                <w:szCs w:val="16"/>
               </w:rPr>
               <w:t>Edwin H. Calderón García</w:t>
             </w:r>
@@ -2971,8 +3180,8 @@
               <w:jc w:val="both"/>
               <w:rPr>
                 <w:rFonts w:ascii="Cambria Math" w:hAnsi="Cambria Math"/>
-                <w:sz w:val="18"/>
-                <w:szCs w:val="18"/>
+                <w:sz w:val="16"/>
+                <w:szCs w:val="16"/>
               </w:rPr>
             </w:pPr>
           </w:p>
@@ -2986,8 +3195,8 @@
         <w:jc w:val="both"/>
         <w:rPr>
           <w:rFonts w:ascii="Cambria Math" w:hAnsi="Cambria Math"/>
-          <w:sz w:val="18"/>
-          <w:szCs w:val="18"/>
+          <w:sz w:val="16"/>
+          <w:szCs w:val="16"/>
         </w:rPr>
       </w:pPr>
     </w:p>
@@ -2998,15 +3207,15 @@
         <w:jc w:val="both"/>
         <w:rPr>
           <w:rFonts w:ascii="Cambria Math" w:hAnsi="Cambria Math"/>
-          <w:sz w:val="18"/>
-          <w:szCs w:val="18"/>
-        </w:rPr>
-      </w:pPr>
-      <w:r>
-        <w:rPr>
-          <w:rFonts w:ascii="Cambria Math" w:hAnsi="Cambria Math"/>
-          <w:sz w:val="18"/>
-          <w:szCs w:val="18"/>
+          <w:sz w:val="16"/>
+          <w:szCs w:val="16"/>
+        </w:rPr>
+      </w:pPr>
+      <w:r>
+        <w:rPr>
+          <w:rFonts w:ascii="Cambria Math" w:hAnsi="Cambria Math"/>
+          <w:sz w:val="16"/>
+          <w:szCs w:val="16"/>
         </w:rPr>
         <w:t>3.1 Pregunta de negocio</w:t>
       </w:r>
@@ -3017,16 +3226,16 @@
         <w:jc w:val="both"/>
         <w:rPr>
           <w:rFonts w:ascii="Cambria Math" w:hAnsi="Cambria Math"/>
-          <w:sz w:val="18"/>
-          <w:szCs w:val="18"/>
-          <w:lang w:val="es-CO"/>
-        </w:rPr>
-      </w:pPr>
-      <w:r>
-        <w:rPr>
-          <w:rFonts w:ascii="Cambria Math" w:hAnsi="Cambria Math"/>
-          <w:sz w:val="18"/>
-          <w:szCs w:val="18"/>
+          <w:sz w:val="16"/>
+          <w:szCs w:val="16"/>
+          <w:lang w:val="es-CO"/>
+        </w:rPr>
+      </w:pPr>
+      <w:r>
+        <w:rPr>
+          <w:rFonts w:ascii="Cambria Math" w:hAnsi="Cambria Math"/>
+          <w:sz w:val="16"/>
+          <w:szCs w:val="16"/>
           <w:lang w:val="es-CO"/>
         </w:rPr>
         <w:t>¿Cómo se comporta la ejecución financiera de los contratos de INVIAS y cuáles presentan mayores niveles de recursos pendientes de ejecución, recursos pendientes de pago o extensiones en el plazo contractual que puedan requerir seguimiento?</w:t>
@@ -3039,8 +3248,8 @@
         <w:jc w:val="both"/>
         <w:rPr>
           <w:rFonts w:ascii="Cambria Math" w:hAnsi="Cambria Math"/>
-          <w:sz w:val="18"/>
-          <w:szCs w:val="18"/>
+          <w:sz w:val="16"/>
+          <w:szCs w:val="16"/>
           <w:lang w:val="es-CO"/>
         </w:rPr>
       </w:pPr>
@@ -3052,16 +3261,16 @@
         <w:jc w:val="both"/>
         <w:rPr>
           <w:rFonts w:ascii="Cambria Math" w:hAnsi="Cambria Math"/>
-          <w:sz w:val="18"/>
-          <w:szCs w:val="18"/>
-          <w:lang w:val="es-CO"/>
-        </w:rPr>
-      </w:pPr>
-      <w:r>
-        <w:rPr>
-          <w:rFonts w:ascii="Cambria Math" w:hAnsi="Cambria Math"/>
-          <w:sz w:val="18"/>
-          <w:szCs w:val="18"/>
+          <w:sz w:val="16"/>
+          <w:szCs w:val="16"/>
+          <w:lang w:val="es-CO"/>
+        </w:rPr>
+      </w:pPr>
+      <w:r>
+        <w:rPr>
+          <w:rFonts w:ascii="Cambria Math" w:hAnsi="Cambria Math"/>
+          <w:sz w:val="16"/>
+          <w:szCs w:val="16"/>
           <w:lang w:val="es-CO"/>
         </w:rPr>
         <w:t>3.2 Datos y enfoque de análisis</w:t>
@@ -3077,8 +3286,8 @@
           <w:b w:val="0"/>
           <w:bCs w:val="0"/>
           <w:color w:val="auto"/>
-          <w:sz w:val="18"/>
-          <w:szCs w:val="18"/>
+          <w:sz w:val="16"/>
+          <w:szCs w:val="16"/>
           <w:lang w:val="es-CO"/>
         </w:rPr>
       </w:pPr>
@@ -3088,8 +3297,8 @@
           <w:b w:val="0"/>
           <w:bCs w:val="0"/>
           <w:color w:val="auto"/>
-          <w:sz w:val="18"/>
-          <w:szCs w:val="18"/>
+          <w:sz w:val="16"/>
+          <w:szCs w:val="16"/>
           <w:lang w:val="es-CO"/>
         </w:rPr>
         <w:t>Se analizaron 20.718 contratos de INVIAS, utilizando variables financieras y contractuales relacionadas con valor contratado, facturación, pagos, ejecución, estado, duración y modificaciones de plazo.</w:t>
@@ -3105,8 +3314,8 @@
           <w:b w:val="0"/>
           <w:bCs w:val="0"/>
           <w:color w:val="auto"/>
-          <w:sz w:val="18"/>
-          <w:szCs w:val="18"/>
+          <w:sz w:val="16"/>
+          <w:szCs w:val="16"/>
           <w:lang w:val="es-CO"/>
         </w:rPr>
       </w:pPr>
@@ -3121,8 +3330,8 @@
           <w:b w:val="0"/>
           <w:bCs w:val="0"/>
           <w:color w:val="auto"/>
-          <w:sz w:val="18"/>
-          <w:szCs w:val="18"/>
+          <w:sz w:val="16"/>
+          <w:szCs w:val="16"/>
           <w:lang w:val="es-CO"/>
         </w:rPr>
       </w:pPr>
@@ -3132,8 +3341,8 @@
           <w:b w:val="0"/>
           <w:bCs w:val="0"/>
           <w:color w:val="auto"/>
-          <w:sz w:val="18"/>
-          <w:szCs w:val="18"/>
+          <w:sz w:val="16"/>
+          <w:szCs w:val="16"/>
           <w:lang w:val="es-CO"/>
         </w:rPr>
         <w:t>Se calcularon los porcentajes de ejecución y pago, recursos pendientes de ejecución, días adicionados y existencia de extensión contractual. Se realizaron análisis de distribución, concentración, relación entre ejecución y pago y comparación entre contratos con y sin extensión.</w:t>
@@ -3149,8 +3358,8 @@
           <w:b w:val="0"/>
           <w:bCs w:val="0"/>
           <w:color w:val="auto"/>
-          <w:sz w:val="18"/>
-          <w:szCs w:val="18"/>
+          <w:sz w:val="16"/>
+          <w:szCs w:val="16"/>
           <w:lang w:val="es-CO"/>
         </w:rPr>
       </w:pPr>
@@ -3165,8 +3374,8 @@
           <w:b w:val="0"/>
           <w:bCs w:val="0"/>
           <w:color w:val="auto"/>
-          <w:sz w:val="18"/>
-          <w:szCs w:val="18"/>
+          <w:sz w:val="16"/>
+          <w:szCs w:val="16"/>
           <w:lang w:val="es-CO"/>
         </w:rPr>
       </w:pPr>
@@ -3176,8 +3385,8 @@
           <w:b w:val="0"/>
           <w:bCs w:val="0"/>
           <w:color w:val="auto"/>
-          <w:sz w:val="18"/>
-          <w:szCs w:val="18"/>
+          <w:sz w:val="16"/>
+          <w:szCs w:val="16"/>
           <w:lang w:val="es-CO"/>
         </w:rPr>
         <w:t>Para priorizar contratos para seguimiento se identificaron aquellos que superan simultáneamente el percentil 90 de recursos pendientes de ejecución y el percentil 90 de días adicionados.</w:t>
@@ -3190,8 +3399,8 @@
         <w:jc w:val="both"/>
         <w:rPr>
           <w:rFonts w:ascii="Cambria Math" w:hAnsi="Cambria Math"/>
-          <w:sz w:val="18"/>
-          <w:szCs w:val="18"/>
+          <w:sz w:val="16"/>
+          <w:szCs w:val="16"/>
           <w:lang w:val="es-CO"/>
         </w:rPr>
       </w:pPr>
@@ -3203,16 +3412,16 @@
         <w:jc w:val="both"/>
         <w:rPr>
           <w:rFonts w:ascii="Cambria Math" w:hAnsi="Cambria Math"/>
-          <w:sz w:val="18"/>
-          <w:szCs w:val="18"/>
-          <w:lang w:val="es-CO"/>
-        </w:rPr>
-      </w:pPr>
-      <w:r>
-        <w:rPr>
-          <w:rFonts w:ascii="Cambria Math" w:hAnsi="Cambria Math"/>
-          <w:sz w:val="18"/>
-          <w:szCs w:val="18"/>
+          <w:sz w:val="16"/>
+          <w:szCs w:val="16"/>
+          <w:lang w:val="es-CO"/>
+        </w:rPr>
+      </w:pPr>
+      <w:r>
+        <w:rPr>
+          <w:rFonts w:ascii="Cambria Math" w:hAnsi="Cambria Math"/>
+          <w:sz w:val="16"/>
+          <w:szCs w:val="16"/>
           <w:lang w:val="es-CO"/>
         </w:rPr>
         <w:t>3.3 Hallazgos principales</w:t>
@@ -3228,8 +3437,8 @@
         <w:jc w:val="both"/>
         <w:rPr>
           <w:rFonts w:ascii="Cambria Math" w:eastAsia="Times New Roman" w:hAnsi="Cambria Math" w:cs="Times New Roman"/>
-          <w:sz w:val="18"/>
-          <w:szCs w:val="18"/>
+          <w:sz w:val="16"/>
+          <w:szCs w:val="16"/>
           <w:lang w:val="es-CO" w:eastAsia="es-ES_tradnl"/>
         </w:rPr>
       </w:pPr>
@@ -3238,8 +3447,8 @@
           <w:rFonts w:ascii="Cambria Math" w:eastAsia="Times New Roman" w:hAnsi="Cambria Math" w:cs="Times New Roman"/>
           <w:b/>
           <w:bCs/>
-          <w:sz w:val="18"/>
-          <w:szCs w:val="18"/>
+          <w:sz w:val="16"/>
+          <w:szCs w:val="16"/>
           <w:lang w:val="es-CO" w:eastAsia="es-ES_tradnl"/>
         </w:rPr>
         <w:t>11.310 contratos (54,6 %) presentan 0 % de ejecución</w:t>
@@ -3247,8 +3456,8 @@
       <w:r>
         <w:rPr>
           <w:rFonts w:ascii="Cambria Math" w:eastAsia="Times New Roman" w:hAnsi="Cambria Math" w:cs="Times New Roman"/>
-          <w:sz w:val="18"/>
-          <w:szCs w:val="18"/>
+          <w:sz w:val="16"/>
+          <w:szCs w:val="16"/>
           <w:lang w:val="es-CO" w:eastAsia="es-ES_tradnl"/>
         </w:rPr>
         <w:t xml:space="preserve">; 6.098 se encuentran entre 50 % y 99 % y 1.285 presentan ejecución ≥100 %. </w:t>
@@ -3264,8 +3473,8 @@
         <w:jc w:val="both"/>
         <w:rPr>
           <w:rFonts w:ascii="Cambria Math" w:eastAsia="Times New Roman" w:hAnsi="Cambria Math" w:cs="Times New Roman"/>
-          <w:sz w:val="18"/>
-          <w:szCs w:val="18"/>
+          <w:sz w:val="16"/>
+          <w:szCs w:val="16"/>
           <w:lang w:val="es-CO" w:eastAsia="es-ES_tradnl"/>
         </w:rPr>
       </w:pPr>
@@ -3274,8 +3483,8 @@
           <w:rFonts w:ascii="Cambria Math" w:eastAsia="Times New Roman" w:hAnsi="Cambria Math" w:cs="Times New Roman"/>
           <w:b/>
           <w:bCs/>
-          <w:sz w:val="18"/>
-          <w:szCs w:val="18"/>
+          <w:sz w:val="16"/>
+          <w:szCs w:val="16"/>
           <w:lang w:val="es-CO" w:eastAsia="es-ES_tradnl"/>
         </w:rPr>
         <w:t>18.228 contratos</w:t>
@@ -3283,8 +3492,8 @@
       <w:r>
         <w:rPr>
           <w:rFonts w:ascii="Cambria Math" w:eastAsia="Times New Roman" w:hAnsi="Cambria Math" w:cs="Times New Roman"/>
-          <w:sz w:val="18"/>
-          <w:szCs w:val="18"/>
+          <w:sz w:val="16"/>
+          <w:szCs w:val="16"/>
           <w:lang w:val="es-CO" w:eastAsia="es-ES_tradnl"/>
         </w:rPr>
         <w:t xml:space="preserve"> presentan recursos pendientes de ejecución positivos, por aproximadamente </w:t>
@@ -3294,8 +3503,8 @@
           <w:rFonts w:ascii="Cambria Math" w:eastAsia="Times New Roman" w:hAnsi="Cambria Math" w:cs="Times New Roman"/>
           <w:b/>
           <w:bCs/>
-          <w:sz w:val="18"/>
-          <w:szCs w:val="18"/>
+          <w:sz w:val="16"/>
+          <w:szCs w:val="16"/>
           <w:lang w:val="es-CO" w:eastAsia="es-ES_tradnl"/>
         </w:rPr>
         <w:t>$38,1 billones</w:t>
@@ -3303,8 +3512,8 @@
       <w:r>
         <w:rPr>
           <w:rFonts w:ascii="Cambria Math" w:eastAsia="Times New Roman" w:hAnsi="Cambria Math" w:cs="Times New Roman"/>
-          <w:sz w:val="18"/>
-          <w:szCs w:val="18"/>
+          <w:sz w:val="16"/>
+          <w:szCs w:val="16"/>
           <w:lang w:val="es-CO" w:eastAsia="es-ES_tradnl"/>
         </w:rPr>
         <w:t xml:space="preserve">. </w:t>
@@ -3320,16 +3529,16 @@
         <w:jc w:val="both"/>
         <w:rPr>
           <w:rFonts w:ascii="Cambria Math" w:eastAsia="Times New Roman" w:hAnsi="Cambria Math" w:cs="Times New Roman"/>
-          <w:sz w:val="18"/>
-          <w:szCs w:val="18"/>
+          <w:sz w:val="16"/>
+          <w:szCs w:val="16"/>
           <w:lang w:val="es-CO" w:eastAsia="es-ES_tradnl"/>
         </w:rPr>
       </w:pPr>
       <w:r>
         <w:rPr>
           <w:rFonts w:ascii="Cambria Math" w:eastAsia="Times New Roman" w:hAnsi="Cambria Math" w:cs="Times New Roman"/>
-          <w:sz w:val="18"/>
-          <w:szCs w:val="18"/>
+          <w:sz w:val="16"/>
+          <w:szCs w:val="16"/>
           <w:lang w:val="es-CO" w:eastAsia="es-ES_tradnl"/>
         </w:rPr>
         <w:t xml:space="preserve">La ejecución y el pago presentan una </w:t>
@@ -3339,8 +3548,8 @@
           <w:rFonts w:ascii="Cambria Math" w:eastAsia="Times New Roman" w:hAnsi="Cambria Math" w:cs="Times New Roman"/>
           <w:b/>
           <w:bCs/>
-          <w:sz w:val="18"/>
-          <w:szCs w:val="18"/>
+          <w:sz w:val="16"/>
+          <w:szCs w:val="16"/>
           <w:lang w:val="es-CO" w:eastAsia="es-ES_tradnl"/>
         </w:rPr>
         <w:t>correlación de 0,989</w:t>
@@ -3348,8 +3557,8 @@
       <w:r>
         <w:rPr>
           <w:rFonts w:ascii="Cambria Math" w:eastAsia="Times New Roman" w:hAnsi="Cambria Math" w:cs="Times New Roman"/>
-          <w:sz w:val="18"/>
-          <w:szCs w:val="18"/>
+          <w:sz w:val="16"/>
+          <w:szCs w:val="16"/>
           <w:lang w:val="es-CO" w:eastAsia="es-ES_tradnl"/>
         </w:rPr>
         <w:t xml:space="preserve">, evidenciando una fuerte asociación entre ambos indicadores. </w:t>
@@ -3365,8 +3574,8 @@
         <w:jc w:val="both"/>
         <w:rPr>
           <w:rFonts w:ascii="Cambria Math" w:eastAsia="Times New Roman" w:hAnsi="Cambria Math" w:cs="Times New Roman"/>
-          <w:sz w:val="18"/>
-          <w:szCs w:val="18"/>
+          <w:sz w:val="16"/>
+          <w:szCs w:val="16"/>
           <w:lang w:val="es-CO" w:eastAsia="es-ES_tradnl"/>
         </w:rPr>
       </w:pPr>
@@ -3375,8 +3584,8 @@
           <w:rFonts w:ascii="Cambria Math" w:eastAsia="Times New Roman" w:hAnsi="Cambria Math" w:cs="Times New Roman"/>
           <w:b/>
           <w:bCs/>
-          <w:sz w:val="18"/>
-          <w:szCs w:val="18"/>
+          <w:sz w:val="16"/>
+          <w:szCs w:val="16"/>
           <w:lang w:val="es-CO" w:eastAsia="es-ES_tradnl"/>
         </w:rPr>
         <w:t>3.728 contratos</w:t>
@@ -3384,8 +3593,8 @@
       <w:r>
         <w:rPr>
           <w:rFonts w:ascii="Cambria Math" w:eastAsia="Times New Roman" w:hAnsi="Cambria Math" w:cs="Times New Roman"/>
-          <w:sz w:val="18"/>
-          <w:szCs w:val="18"/>
+          <w:sz w:val="16"/>
+          <w:szCs w:val="16"/>
           <w:lang w:val="es-CO" w:eastAsia="es-ES_tradnl"/>
         </w:rPr>
         <w:t xml:space="preserve"> presentan extensiones de plazo; la mediana es de </w:t>
@@ -3395,8 +3604,8 @@
           <w:rFonts w:ascii="Cambria Math" w:eastAsia="Times New Roman" w:hAnsi="Cambria Math" w:cs="Times New Roman"/>
           <w:b/>
           <w:bCs/>
-          <w:sz w:val="18"/>
-          <w:szCs w:val="18"/>
+          <w:sz w:val="16"/>
+          <w:szCs w:val="16"/>
           <w:lang w:val="es-CO" w:eastAsia="es-ES_tradnl"/>
         </w:rPr>
         <w:t>61 días adicionados</w:t>
@@ -3404,8 +3613,8 @@
       <w:r>
         <w:rPr>
           <w:rFonts w:ascii="Cambria Math" w:eastAsia="Times New Roman" w:hAnsi="Cambria Math" w:cs="Times New Roman"/>
-          <w:sz w:val="18"/>
-          <w:szCs w:val="18"/>
+          <w:sz w:val="16"/>
+          <w:szCs w:val="16"/>
           <w:lang w:val="es-CO" w:eastAsia="es-ES_tradnl"/>
         </w:rPr>
         <w:t xml:space="preserve">. </w:t>
@@ -3421,16 +3630,16 @@
         <w:jc w:val="both"/>
         <w:rPr>
           <w:rFonts w:ascii="Cambria Math" w:eastAsia="Times New Roman" w:hAnsi="Cambria Math" w:cs="Times New Roman"/>
-          <w:sz w:val="18"/>
-          <w:szCs w:val="18"/>
+          <w:sz w:val="16"/>
+          <w:szCs w:val="16"/>
           <w:lang w:val="es-CO" w:eastAsia="es-ES_tradnl"/>
         </w:rPr>
       </w:pPr>
       <w:r>
         <w:rPr>
           <w:rFonts w:ascii="Cambria Math" w:eastAsia="Times New Roman" w:hAnsi="Cambria Math" w:cs="Times New Roman"/>
-          <w:sz w:val="18"/>
-          <w:szCs w:val="18"/>
+          <w:sz w:val="16"/>
+          <w:szCs w:val="16"/>
           <w:lang w:val="es-CO" w:eastAsia="es-ES_tradnl"/>
         </w:rPr>
         <w:t xml:space="preserve">Los contratos con extensión presentan una mediana de recursos pendientes de ejecución aproximadamente </w:t>
@@ -3440,8 +3649,8 @@
           <w:rFonts w:ascii="Cambria Math" w:eastAsia="Times New Roman" w:hAnsi="Cambria Math" w:cs="Times New Roman"/>
           <w:b/>
           <w:bCs/>
-          <w:sz w:val="18"/>
-          <w:szCs w:val="18"/>
+          <w:sz w:val="16"/>
+          <w:szCs w:val="16"/>
           <w:lang w:val="es-CO" w:eastAsia="es-ES_tradnl"/>
         </w:rPr>
         <w:t>9,6 veces superior</w:t>
@@ -3449,8 +3658,8 @@
       <w:r>
         <w:rPr>
           <w:rFonts w:ascii="Cambria Math" w:eastAsia="Times New Roman" w:hAnsi="Cambria Math" w:cs="Times New Roman"/>
-          <w:sz w:val="18"/>
-          <w:szCs w:val="18"/>
+          <w:sz w:val="16"/>
+          <w:szCs w:val="16"/>
           <w:lang w:val="es-CO" w:eastAsia="es-ES_tradnl"/>
         </w:rPr>
         <w:t xml:space="preserve"> a la de los contratos sin extensión. </w:t>
@@ -3466,16 +3675,16 @@
         <w:jc w:val="both"/>
         <w:rPr>
           <w:rFonts w:ascii="Cambria Math" w:eastAsia="Times New Roman" w:hAnsi="Cambria Math" w:cs="Times New Roman"/>
-          <w:sz w:val="18"/>
-          <w:szCs w:val="18"/>
+          <w:sz w:val="16"/>
+          <w:szCs w:val="16"/>
           <w:lang w:val="es-CO" w:eastAsia="es-ES_tradnl"/>
         </w:rPr>
       </w:pPr>
       <w:r>
         <w:rPr>
           <w:rFonts w:ascii="Cambria Math" w:eastAsia="Times New Roman" w:hAnsi="Cambria Math" w:cs="Times New Roman"/>
-          <w:sz w:val="18"/>
-          <w:szCs w:val="18"/>
+          <w:sz w:val="16"/>
+          <w:szCs w:val="16"/>
           <w:lang w:val="es-CO" w:eastAsia="es-ES_tradnl"/>
         </w:rPr>
         <w:t xml:space="preserve">Se identificaron </w:t>
@@ -3485,8 +3694,8 @@
           <w:rFonts w:ascii="Cambria Math" w:eastAsia="Times New Roman" w:hAnsi="Cambria Math" w:cs="Times New Roman"/>
           <w:b/>
           <w:bCs/>
-          <w:sz w:val="18"/>
-          <w:szCs w:val="18"/>
+          <w:sz w:val="16"/>
+          <w:szCs w:val="16"/>
           <w:lang w:val="es-CO" w:eastAsia="es-ES_tradnl"/>
         </w:rPr>
         <w:t>750 contratos prioritarios</w:t>
@@ -3494,8 +3703,8 @@
       <w:r>
         <w:rPr>
           <w:rFonts w:ascii="Cambria Math" w:eastAsia="Times New Roman" w:hAnsi="Cambria Math" w:cs="Times New Roman"/>
-          <w:sz w:val="18"/>
-          <w:szCs w:val="18"/>
+          <w:sz w:val="16"/>
+          <w:szCs w:val="16"/>
           <w:lang w:val="es-CO" w:eastAsia="es-ES_tradnl"/>
         </w:rPr>
         <w:t xml:space="preserve">; el 100 % presenta extensión contractual. La mayoría se encuentra en estado </w:t>
@@ -3505,8 +3714,8 @@
           <w:rFonts w:ascii="Cambria Math" w:eastAsia="Times New Roman" w:hAnsi="Cambria Math" w:cs="Times New Roman"/>
           <w:b/>
           <w:bCs/>
-          <w:sz w:val="18"/>
-          <w:szCs w:val="18"/>
+          <w:sz w:val="16"/>
+          <w:szCs w:val="16"/>
           <w:lang w:val="es-CO" w:eastAsia="es-ES_tradnl"/>
         </w:rPr>
         <w:t>Modificado (689)</w:t>
@@ -3514,8 +3723,8 @@
       <w:r>
         <w:rPr>
           <w:rFonts w:ascii="Cambria Math" w:eastAsia="Times New Roman" w:hAnsi="Cambria Math" w:cs="Times New Roman"/>
-          <w:sz w:val="18"/>
-          <w:szCs w:val="18"/>
+          <w:sz w:val="16"/>
+          <w:szCs w:val="16"/>
           <w:lang w:val="es-CO" w:eastAsia="es-ES_tradnl"/>
         </w:rPr>
         <w:t xml:space="preserve"> o </w:t>
@@ -3525,8 +3734,8 @@
           <w:rFonts w:ascii="Cambria Math" w:eastAsia="Times New Roman" w:hAnsi="Cambria Math" w:cs="Times New Roman"/>
           <w:b/>
           <w:bCs/>
-          <w:sz w:val="18"/>
-          <w:szCs w:val="18"/>
+          <w:sz w:val="16"/>
+          <w:szCs w:val="16"/>
           <w:lang w:val="es-CO" w:eastAsia="es-ES_tradnl"/>
         </w:rPr>
         <w:t>Suspendido (57)</w:t>
@@ -3534,8 +3743,8 @@
       <w:r>
         <w:rPr>
           <w:rFonts w:ascii="Cambria Math" w:eastAsia="Times New Roman" w:hAnsi="Cambria Math" w:cs="Times New Roman"/>
-          <w:sz w:val="18"/>
-          <w:szCs w:val="18"/>
+          <w:sz w:val="16"/>
+          <w:szCs w:val="16"/>
           <w:lang w:val="es-CO" w:eastAsia="es-ES_tradnl"/>
         </w:rPr>
         <w:t xml:space="preserve">. </w:t>
@@ -3547,8 +3756,8 @@
         <w:jc w:val="both"/>
         <w:rPr>
           <w:rFonts w:ascii="Cambria Math" w:eastAsia="Times New Roman" w:hAnsi="Cambria Math" w:cs="Times New Roman"/>
-          <w:sz w:val="18"/>
-          <w:szCs w:val="18"/>
+          <w:sz w:val="16"/>
+          <w:szCs w:val="16"/>
           <w:lang w:val="es-CO" w:eastAsia="es-ES_tradnl"/>
         </w:rPr>
       </w:pPr>
@@ -3557,8 +3766,8 @@
           <w:rFonts w:ascii="Cambria Math" w:eastAsia="Times New Roman" w:hAnsi="Cambria Math" w:cs="Times New Roman"/>
           <w:b/>
           <w:bCs/>
-          <w:sz w:val="18"/>
-          <w:szCs w:val="18"/>
+          <w:sz w:val="16"/>
+          <w:szCs w:val="16"/>
           <w:lang w:val="es-CO" w:eastAsia="es-ES_tradnl"/>
         </w:rPr>
         <w:t>Nota:</w:t>
@@ -3566,8 +3775,8 @@
       <w:r>
         <w:rPr>
           <w:rFonts w:ascii="Cambria Math" w:eastAsia="Times New Roman" w:hAnsi="Cambria Math" w:cs="Times New Roman"/>
-          <w:sz w:val="18"/>
-          <w:szCs w:val="18"/>
+          <w:sz w:val="16"/>
+          <w:szCs w:val="16"/>
           <w:lang w:val="es-CO" w:eastAsia="es-ES_tradnl"/>
         </w:rPr>
         <w:t xml:space="preserve"> Los valores extremos identificados en “pendiente de pago reportado” se conservaron como parte de la información de la fuente y se documentaron como una limitación para su interpretación.</w:t>
@@ -3580,16 +3789,16 @@
         <w:jc w:val="both"/>
         <w:rPr>
           <w:rFonts w:ascii="Cambria Math" w:hAnsi="Cambria Math"/>
-          <w:sz w:val="18"/>
-          <w:szCs w:val="18"/>
-          <w:lang w:val="es-CO"/>
-        </w:rPr>
-      </w:pPr>
-      <w:r>
-        <w:rPr>
-          <w:rFonts w:ascii="Cambria Math" w:hAnsi="Cambria Math"/>
-          <w:sz w:val="18"/>
-          <w:szCs w:val="18"/>
+          <w:sz w:val="16"/>
+          <w:szCs w:val="16"/>
+          <w:lang w:val="es-CO"/>
+        </w:rPr>
+      </w:pPr>
+      <w:r>
+        <w:rPr>
+          <w:rFonts w:ascii="Cambria Math" w:hAnsi="Cambria Math"/>
+          <w:sz w:val="16"/>
+          <w:szCs w:val="16"/>
           <w:lang w:val="es-CO"/>
         </w:rPr>
         <w:t>3.4 Respuesta a la pregunta de negocio</w:t>
@@ -3602,15 +3811,15 @@
         <w:jc w:val="both"/>
         <w:rPr>
           <w:rFonts w:ascii="Cambria Math" w:hAnsi="Cambria Math"/>
-          <w:sz w:val="18"/>
-          <w:szCs w:val="18"/>
-        </w:rPr>
-      </w:pPr>
-      <w:r>
-        <w:rPr>
-          <w:rFonts w:ascii="Cambria Math" w:hAnsi="Cambria Math"/>
-          <w:sz w:val="18"/>
-          <w:szCs w:val="18"/>
+          <w:sz w:val="16"/>
+          <w:szCs w:val="16"/>
+        </w:rPr>
+      </w:pPr>
+      <w:r>
+        <w:rPr>
+          <w:rFonts w:ascii="Cambria Math" w:hAnsi="Cambria Math"/>
+          <w:sz w:val="16"/>
+          <w:szCs w:val="16"/>
         </w:rPr>
         <w:t xml:space="preserve">La ejecución financiera presenta una </w:t>
       </w:r>
@@ -3618,16 +3827,16 @@
         <w:rPr>
           <w:rStyle w:val="Fuerte"/>
           <w:rFonts w:ascii="Cambria Math" w:hAnsi="Cambria Math"/>
-          <w:sz w:val="18"/>
-          <w:szCs w:val="18"/>
+          <w:sz w:val="16"/>
+          <w:szCs w:val="16"/>
         </w:rPr>
         <w:t>alta concentración de contratos con baja o nula ejecución</w:t>
       </w:r>
       <w:r>
         <w:rPr>
           <w:rFonts w:ascii="Cambria Math" w:hAnsi="Cambria Math"/>
-          <w:sz w:val="18"/>
-          <w:szCs w:val="18"/>
+          <w:sz w:val="16"/>
+          <w:szCs w:val="16"/>
         </w:rPr>
         <w:t xml:space="preserve"> y una importante dispersión en los recursos pendientes. Las extensiones contractuales también están asociadas con mayores niveles de recursos pendientes de ejecución.</w:t>
       </w:r>
@@ -3639,15 +3848,15 @@
         <w:jc w:val="both"/>
         <w:rPr>
           <w:rFonts w:ascii="Cambria Math" w:hAnsi="Cambria Math"/>
-          <w:sz w:val="18"/>
-          <w:szCs w:val="18"/>
-        </w:rPr>
-      </w:pPr>
-      <w:r>
-        <w:rPr>
-          <w:rFonts w:ascii="Cambria Math" w:hAnsi="Cambria Math"/>
-          <w:sz w:val="18"/>
-          <w:szCs w:val="18"/>
+          <w:sz w:val="16"/>
+          <w:szCs w:val="16"/>
+        </w:rPr>
+      </w:pPr>
+      <w:r>
+        <w:rPr>
+          <w:rFonts w:ascii="Cambria Math" w:hAnsi="Cambria Math"/>
+          <w:sz w:val="16"/>
+          <w:szCs w:val="16"/>
         </w:rPr>
         <w:t xml:space="preserve">A partir de estos patrones se identificaron </w:t>
       </w:r>
@@ -3655,16 +3864,16 @@
         <w:rPr>
           <w:rStyle w:val="Fuerte"/>
           <w:rFonts w:ascii="Cambria Math" w:hAnsi="Cambria Math"/>
-          <w:sz w:val="18"/>
-          <w:szCs w:val="18"/>
+          <w:sz w:val="16"/>
+          <w:szCs w:val="16"/>
         </w:rPr>
         <w:t>750 contratos prioritarios para seguimiento</w:t>
       </w:r>
       <w:r>
         <w:rPr>
           <w:rFonts w:ascii="Cambria Math" w:hAnsi="Cambria Math"/>
-          <w:sz w:val="18"/>
-          <w:szCs w:val="18"/>
+          <w:sz w:val="16"/>
+          <w:szCs w:val="16"/>
         </w:rPr>
         <w:t>, definidos por presentar simultáneamente altos niveles de recursos pendientes de ejecución y de días adicionados. Estos contratos constituyen un universo focalizado para revisión y gestión.</w:t>
       </w:r>
@@ -3676,16 +3885,16 @@
         <w:jc w:val="both"/>
         <w:rPr>
           <w:rFonts w:ascii="Cambria Math" w:hAnsi="Cambria Math"/>
-          <w:sz w:val="18"/>
-          <w:szCs w:val="18"/>
-          <w:lang w:val="es-CO"/>
-        </w:rPr>
-      </w:pPr>
-      <w:r>
-        <w:rPr>
-          <w:rFonts w:ascii="Cambria Math" w:hAnsi="Cambria Math"/>
-          <w:sz w:val="18"/>
-          <w:szCs w:val="18"/>
+          <w:sz w:val="16"/>
+          <w:szCs w:val="16"/>
+          <w:lang w:val="es-CO"/>
+        </w:rPr>
+      </w:pPr>
+      <w:r>
+        <w:rPr>
+          <w:rFonts w:ascii="Cambria Math" w:hAnsi="Cambria Math"/>
+          <w:sz w:val="16"/>
+          <w:szCs w:val="16"/>
           <w:lang w:val="es-CO"/>
         </w:rPr>
         <w:t>3.5 Implicación para la toma de decisiones</w:t>
@@ -3696,16 +3905,16 @@
         <w:jc w:val="both"/>
         <w:rPr>
           <w:rFonts w:ascii="Cambria Math" w:hAnsi="Cambria Math"/>
-          <w:sz w:val="18"/>
-          <w:szCs w:val="18"/>
-          <w:lang w:val="es-CO"/>
-        </w:rPr>
-      </w:pPr>
-      <w:r>
-        <w:rPr>
-          <w:rFonts w:ascii="Cambria Math" w:hAnsi="Cambria Math"/>
-          <w:sz w:val="18"/>
-          <w:szCs w:val="18"/>
+          <w:sz w:val="16"/>
+          <w:szCs w:val="16"/>
+          <w:lang w:val="es-CO"/>
+        </w:rPr>
+      </w:pPr>
+      <w:r>
+        <w:rPr>
+          <w:rFonts w:ascii="Cambria Math" w:hAnsi="Cambria Math"/>
+          <w:sz w:val="16"/>
+          <w:szCs w:val="16"/>
           <w:lang w:val="es-CO"/>
         </w:rPr>
         <w:t>Los resultados permiten priorizar el seguimiento contractual en lugar de revisar los 20.718 contratos con el mismo nivel de atención.</w:t>
@@ -3716,16 +3925,16 @@
         <w:jc w:val="both"/>
         <w:rPr>
           <w:rFonts w:ascii="Cambria Math" w:hAnsi="Cambria Math"/>
-          <w:sz w:val="18"/>
-          <w:szCs w:val="18"/>
-          <w:lang w:val="es-CO"/>
-        </w:rPr>
-      </w:pPr>
-      <w:r>
-        <w:rPr>
-          <w:rFonts w:ascii="Cambria Math" w:hAnsi="Cambria Math"/>
-          <w:sz w:val="18"/>
-          <w:szCs w:val="18"/>
+          <w:sz w:val="16"/>
+          <w:szCs w:val="16"/>
+          <w:lang w:val="es-CO"/>
+        </w:rPr>
+      </w:pPr>
+      <w:r>
+        <w:rPr>
+          <w:rFonts w:ascii="Cambria Math" w:hAnsi="Cambria Math"/>
+          <w:sz w:val="16"/>
+          <w:szCs w:val="16"/>
           <w:lang w:val="es-CO"/>
         </w:rPr>
         <w:t>La regla de priorización concentra la revisión en contratos con mayor exposición financiera pendiente y mayores extensiones de plazo. El análisis debe utilizarse como mecanismo de focalización y generación de señales de seguimiento, no como evidencia de irregularidad o incumplimiento.</w:t>
@@ -3736,16 +3945,16 @@
         <w:jc w:val="both"/>
         <w:rPr>
           <w:rFonts w:ascii="Cambria Math" w:hAnsi="Cambria Math"/>
-          <w:sz w:val="18"/>
-          <w:szCs w:val="18"/>
-          <w:lang w:val="es-CO"/>
-        </w:rPr>
-      </w:pPr>
-      <w:r>
-        <w:rPr>
-          <w:rFonts w:ascii="Cambria Math" w:hAnsi="Cambria Math"/>
-          <w:sz w:val="18"/>
-          <w:szCs w:val="18"/>
+          <w:sz w:val="16"/>
+          <w:szCs w:val="16"/>
+          <w:lang w:val="es-CO"/>
+        </w:rPr>
+      </w:pPr>
+      <w:r>
+        <w:rPr>
+          <w:rFonts w:ascii="Cambria Math" w:hAnsi="Cambria Math"/>
+          <w:sz w:val="16"/>
+          <w:szCs w:val="16"/>
           <w:lang w:val="es-CO"/>
         </w:rPr>
         <w:t>Algunas visualizaciones importantes que dan sustento al análisis y apoya la toma de decisiones:</w:t>
@@ -3753,61 +3962,98 @@
     </w:p>
     <w:p>
       <w:pPr>
-        <w:pStyle w:val="Prrafodelista"/>
-        <w:numPr>
-          <w:ilvl w:val="0"/>
-          <w:numId w:val="11"/>
-        </w:numPr>
-        <w:jc w:val="both"/>
-        <w:rPr>
-          <w:rFonts w:ascii="Cambria Math" w:hAnsi="Cambria Math"/>
-          <w:sz w:val="18"/>
-          <w:szCs w:val="18"/>
-          <w:lang w:val="es-CO"/>
-        </w:rPr>
-      </w:pPr>
-      <w:r>
-        <w:rPr>
-          <w:rFonts w:ascii="Cambria Math" w:hAnsi="Cambria Math"/>
-          <w:sz w:val="18"/>
-          <w:szCs w:val="18"/>
-          <w:lang w:val="es-CO"/>
-        </w:rPr>
-        <w:t xml:space="preserve">Distribución </w:t>
-      </w:r>
-      <w:r>
-        <w:rPr>
-          <w:rFonts w:ascii="Cambria Math" w:hAnsi="Cambria Math"/>
-          <w:sz w:val="18"/>
-          <w:szCs w:val="18"/>
-          <w:lang w:val="es-CO"/>
-        </w:rPr>
-        <w:t>de contratos por nivel de ejecución</w:t>
-      </w:r>
-    </w:p>
-    <w:p>
-      <w:pPr>
-        <w:pStyle w:val="Prrafodelista"/>
-        <w:numPr>
-          <w:ilvl w:val="0"/>
-          <w:numId w:val="11"/>
-        </w:numPr>
-        <w:jc w:val="both"/>
-        <w:rPr>
-          <w:rFonts w:ascii="Cambria Math" w:hAnsi="Cambria Math"/>
-          <w:sz w:val="18"/>
-          <w:szCs w:val="18"/>
-          <w:lang w:val="es-CO"/>
-        </w:rPr>
-      </w:pPr>
-      <w:r>
-        <w:rPr>
-          <w:rFonts w:ascii="Cambria Math" w:hAnsi="Cambria Math"/>
-          <w:sz w:val="18"/>
-          <w:szCs w:val="18"/>
-          <w:lang w:val="es-CO"/>
-        </w:rPr>
-        <w:t>Contratos prioritarios para seguimiento</w:t>
+        <w:ind w:left="360"/>
+        <w:jc w:val="center"/>
+        <w:rPr>
+          <w:rFonts w:ascii="Cambria Math" w:hAnsi="Cambria Math"/>
+          <w:sz w:val="18"/>
+          <w:szCs w:val="18"/>
+          <w:lang w:val="es-CO"/>
+        </w:rPr>
+      </w:pPr>
+      <w:r>
+        <w:rPr>
+          <w:rFonts w:ascii="Cambria Math" w:hAnsi="Cambria Math"/>
+        </w:rPr>
+        <w:drawing>
+          <wp:inline distT="0" distB="0" distL="0" distR="0" wp14:anchorId="78A854B9" wp14:editId="33FF235A">
+            <wp:extent cx="3634154" cy="1889760"/>
+            <wp:effectExtent l="88900" t="88900" r="86995" b="129540"/>
+            <wp:docPr id="2" name="Imagen 1">
+              <a:extLst xmlns:a="http://schemas.openxmlformats.org/drawingml/2006/main">
+                <a:ext uri="{FF2B5EF4-FFF2-40B4-BE49-F238E27FC236}">
+                  <a16:creationId xmlns:a16="http://schemas.microsoft.com/office/drawing/2014/main" id="{E6441D66-A37D-A733-0D1F-6D27C683E3A3}"/>
+                </a:ext>
+              </a:extLst>
+            </wp:docPr>
+            <wp:cNvGraphicFramePr>
+              <a:graphicFrameLocks xmlns:a="http://schemas.openxmlformats.org/drawingml/2006/main" noChangeAspect="1"/>
+            </wp:cNvGraphicFramePr>
+            <a:graphic xmlns:a="http://schemas.openxmlformats.org/drawingml/2006/main">
+              <a:graphicData uri="http://schemas.openxmlformats.org/drawingml/2006/picture">
+                <pic:pic xmlns:pic="http://schemas.openxmlformats.org/drawingml/2006/picture">
+                  <pic:nvPicPr>
+                    <pic:cNvPr id="2" name="Imagen 1">
+                      <a:extLst>
+                        <a:ext uri="{FF2B5EF4-FFF2-40B4-BE49-F238E27FC236}">
+                          <a16:creationId xmlns:a16="http://schemas.microsoft.com/office/drawing/2014/main" id="{E6441D66-A37D-A733-0D1F-6D27C683E3A3}"/>
+                        </a:ext>
+                      </a:extLst>
+                    </pic:cNvPr>
+                    <pic:cNvPicPr>
+                      <a:picLocks noChangeAspect="1"/>
+                    </pic:cNvPicPr>
+                  </pic:nvPicPr>
+                  <pic:blipFill>
+                    <a:blip r:embed="rId12"/>
+                    <a:stretch>
+                      <a:fillRect/>
+                    </a:stretch>
+                  </pic:blipFill>
+                  <pic:spPr>
+                    <a:xfrm>
+                      <a:off x="0" y="0"/>
+                      <a:ext cx="3713385" cy="1930960"/>
+                    </a:xfrm>
+                    <a:prstGeom prst="rect">
+                      <a:avLst/>
+                    </a:prstGeom>
+                    <a:solidFill>
+                      <a:srgbClr val="FFFFFF">
+                        <a:shade val="85000"/>
+                      </a:srgbClr>
+                    </a:solidFill>
+                    <a:ln w="88900" cap="sq">
+                      <a:solidFill>
+                        <a:srgbClr val="FFFFFF"/>
+                      </a:solidFill>
+                      <a:miter lim="800000"/>
+                    </a:ln>
+                    <a:effectLst>
+                      <a:outerShdw blurRad="55000" dist="18000" dir="5400000" algn="tl" rotWithShape="0">
+                        <a:srgbClr val="000000">
+                          <a:alpha val="40000"/>
+                        </a:srgbClr>
+                      </a:outerShdw>
+                    </a:effectLst>
+                    <a:scene3d>
+                      <a:camera prst="orthographicFront"/>
+                      <a:lightRig rig="twoPt" dir="t">
+                        <a:rot lat="0" lon="0" rev="7200000"/>
+                      </a:lightRig>
+                    </a:scene3d>
+                    <a:sp3d>
+                      <a:bevelT w="25400" h="19050"/>
+                      <a:contourClr>
+                        <a:srgbClr val="FFFFFF"/>
+                      </a:contourClr>
+                    </a:sp3d>
+                  </pic:spPr>
+                </pic:pic>
+              </a:graphicData>
+            </a:graphic>
+          </wp:inline>
+        </w:drawing>
       </w:r>
       <w:r>
         <w:rPr>
@@ -3982,16 +4228,7 @@
                 <w:szCs w:val="18"/>
                 <w:lang w:val="es-ES"/>
               </w:rPr>
-              <w:t>Jhoiner Javier Ramos Ramírez</w:t>
-            </w:r>
-            <w:r>
-              <w:rPr>
-                <w:rFonts w:ascii="Cambria Math" w:eastAsia="Cambria Math" w:hAnsi="Cambria Math" w:cs="Cambria Math"/>
-                <w:sz w:val="18"/>
-                <w:szCs w:val="18"/>
-                <w:lang w:val="es-ES"/>
-              </w:rPr>
-              <w:t xml:space="preserve"> - </w:t>
+              <w:t xml:space="preserve">Jhoiner Javier Ramos Ramírez - </w:t>
             </w:r>
             <w:r>
               <w:rPr>
@@ -4123,6 +4360,7 @@
     </w:p>
     <w:p>
       <w:pPr>
+        <w:spacing w:after="0"/>
         <w:jc w:val="both"/>
         <w:rPr>
           <w:rFonts w:ascii="Cambria Math" w:hAnsi="Cambria Math"/>
@@ -4131,18 +4369,10 @@
           <w:lang w:val="es-CO"/>
         </w:rPr>
       </w:pPr>
-      <w:r>
-        <w:rPr>
-          <w:rFonts w:ascii="Cambria Math" w:hAnsi="Cambria Math"/>
-          <w:sz w:val="18"/>
-          <w:szCs w:val="18"/>
-          <w:lang w:val="es-CO"/>
-        </w:rPr>
-        <w:t>Pregunta 1:</w:t>
-      </w:r>
     </w:p>
     <w:p>
       <w:pPr>
+        <w:spacing w:after="0"/>
         <w:jc w:val="both"/>
         <w:rPr>
           <w:rFonts w:ascii="Cambria Math" w:hAnsi="Cambria Math"/>
@@ -4158,21 +4388,12 @@
           <w:szCs w:val="18"/>
           <w:lang w:val="es-CO"/>
         </w:rPr>
-        <w:t>Pregunta 2:</w:t>
-      </w:r>
-      <w:r>
-        <w:rPr>
-          <w:rFonts w:ascii="Cambria Math" w:hAnsi="Cambria Math"/>
-          <w:b w:val="0"/>
-          <w:sz w:val="18"/>
-          <w:szCs w:val="18"/>
-          <w:lang w:val="es-CO"/>
-        </w:rPr>
-        <w:t xml:space="preserve"> Se normalizó el texto del objeto contractual y la descripción del proceso (mayúsculas, sin tildes, espacios colapsados) para poder buscar sobre él. Se descartaron las variables geográficas estructuradas tras comprobar que no registran el lugar de ejecución, y se documentó esa decisión en el cuaderno de auditoría en lugar de eliminarlas en silencio.</w:t>
+        <w:t>Pregunta 1: Se revisaron tipos de datos, faltantes e inconsistencias. Se conservaron los contratos formalizados y se diferenciaron los registros con valor positivo para los análisis monetarios.</w:t>
       </w:r>
     </w:p>
     <w:p>
       <w:pPr>
+        <w:spacing w:after="0"/>
         <w:jc w:val="both"/>
         <w:rPr>
           <w:rFonts w:ascii="Cambria Math" w:hAnsi="Cambria Math"/>
@@ -4181,50 +4402,26 @@
           <w:lang w:val="es-CO"/>
         </w:rPr>
       </w:pPr>
-      <w:r>
-        <w:rPr>
-          <w:rFonts w:ascii="Cambria Math" w:hAnsi="Cambria Math"/>
-          <w:sz w:val="18"/>
-          <w:szCs w:val="18"/>
-          <w:lang w:val="es-CO"/>
-        </w:rPr>
-        <w:t>Pregunta 3:</w:t>
-      </w:r>
-      <w:r>
-        <w:rPr>
-          <w:rFonts w:ascii="Cambria Math" w:hAnsi="Cambria Math"/>
-          <w:sz w:val="18"/>
-          <w:szCs w:val="18"/>
-          <w:lang w:val="es-CO"/>
-        </w:rPr>
-        <w:t xml:space="preserve"> </w:t>
-      </w:r>
-      <w:r>
-        <w:rPr>
-          <w:rFonts w:ascii="Cambria Math" w:hAnsi="Cambria Math"/>
-          <w:sz w:val="18"/>
-          <w:szCs w:val="18"/>
-          <w:lang w:val="es-CO"/>
-        </w:rPr>
-        <w:t xml:space="preserve">Se realizó depuración de tipos de datos, tratamiento de valores faltantes y estandarización de variables. </w:t>
-      </w:r>
-      <w:r>
-        <w:rPr>
-          <w:rFonts w:ascii="Cambria Math" w:hAnsi="Cambria Math"/>
-          <w:sz w:val="18"/>
-          <w:szCs w:val="18"/>
-          <w:lang w:val="es-CO"/>
-        </w:rPr>
-        <w:t xml:space="preserve">Así mismo </w:t>
-      </w:r>
-      <w:r>
-        <w:rPr>
-          <w:rFonts w:ascii="Cambria Math" w:hAnsi="Cambria Math"/>
-          <w:sz w:val="18"/>
-          <w:szCs w:val="18"/>
-          <w:lang w:val="es-CO"/>
-        </w:rPr>
-        <w:t>se revisaron especialmente los campos financieros, fechas, estados contractuales y variables asociadas a modificaciones y extensiones de plazo.</w:t>
+    </w:p>
+    <w:p>
+      <w:pPr>
+        <w:spacing w:after="0"/>
+        <w:jc w:val="both"/>
+        <w:rPr>
+          <w:rFonts w:ascii="Cambria Math" w:hAnsi="Cambria Math"/>
+          <w:sz w:val="18"/>
+          <w:szCs w:val="18"/>
+          <w:lang w:val="es-CO"/>
+        </w:rPr>
+      </w:pPr>
+      <w:r>
+        <w:rPr>
+          <w:rFonts w:ascii="Cambria Math" w:hAnsi="Cambria Math"/>
+          <w:sz w:val="18"/>
+          <w:szCs w:val="18"/>
+          <w:lang w:val="es-CO"/>
+        </w:rPr>
+        <w:t>Pregunta 2: Se normalizó el texto del objeto y la descripción del proceso para identificar referencias territoriales. Las variables geográficas estructuradas se descartaron tras verificar que correspondían al domicilio de la entidad y no al lugar de ejecución.</w:t>
       </w:r>
     </w:p>
     <w:p>
@@ -4239,141 +4436,6 @@
           <w:lang w:val="es-CO"/>
         </w:rPr>
       </w:pPr>
-      <w:r>
-        <w:rPr>
-          <w:rFonts w:ascii="Cambria Math" w:hAnsi="Cambria Math"/>
-          <w:sz w:val="18"/>
-          <w:szCs w:val="18"/>
-          <w:lang w:val="es-CO"/>
-        </w:rPr>
-        <w:t>4.3 Alistamiento y nuevas características</w:t>
-      </w:r>
-    </w:p>
-    <w:p>
-      <w:pPr>
-        <w:jc w:val="both"/>
-        <w:rPr>
-          <w:rFonts w:ascii="Cambria Math" w:hAnsi="Cambria Math"/>
-          <w:sz w:val="18"/>
-          <w:szCs w:val="18"/>
-          <w:lang w:val="es-CO"/>
-        </w:rPr>
-      </w:pPr>
-      <w:r>
-        <w:rPr>
-          <w:rFonts w:ascii="Cambria Math" w:hAnsi="Cambria Math"/>
-          <w:sz w:val="18"/>
-          <w:szCs w:val="18"/>
-          <w:lang w:val="es-CO"/>
-        </w:rPr>
-        <w:t>Pregunta 1:</w:t>
-      </w:r>
-    </w:p>
-    <w:p>
-      <w:pPr>
-        <w:jc w:val="both"/>
-        <w:rPr>
-          <w:rFonts w:ascii="Cambria Math" w:hAnsi="Cambria Math"/>
-          <w:sz w:val="18"/>
-          <w:szCs w:val="18"/>
-          <w:lang w:val="es-CO"/>
-        </w:rPr>
-      </w:pPr>
-      <w:r>
-        <w:rPr>
-          <w:rFonts w:ascii="Cambria Math" w:hAnsi="Cambria Math"/>
-          <w:sz w:val="18"/>
-          <w:szCs w:val="18"/>
-          <w:lang w:val="es-CO"/>
-        </w:rPr>
-        <w:t>Pregunta 2:</w:t>
-      </w:r>
-      <w:r>
-        <w:rPr>
-          <w:rFonts w:ascii="Cambria Math" w:hAnsi="Cambria Math"/>
-          <w:b w:val="0"/>
-          <w:sz w:val="18"/>
-          <w:szCs w:val="18"/>
-          <w:lang w:val="es-CO"/>
-        </w:rPr>
-        <w:t xml:space="preserve"> Se construyó «departamento_inferido» con un diccionario de alias de los 32 departamentos y Bogotá. Los alias se evalúan de más largo a más corto y el fragmento emparejado se consume, porque de lo contrario «Norte de Santander» también activaba «Santander» y el contrato quedaba asignado a dos departamentos. Se enmascararon seis topónimos ambiguos (San Juan del Cesar, Magdalena Medio, Ciudad Bolívar y los municipios homónimos de Bolívar, Sucre y Córdoba): aparecían en 98 contratos y el tratamiento corrigió 80 asignaciones. Además se derivaron «trazabilidad_territorial», «n_departamentos», «direccion_territorial», «codigo_via» y «ruta_nacional».</w:t>
-      </w:r>
-    </w:p>
-    <w:p>
-      <w:pPr>
-        <w:jc w:val="both"/>
-        <w:rPr>
-          <w:rFonts w:ascii="Cambria Math" w:hAnsi="Cambria Math"/>
-          <w:sz w:val="18"/>
-          <w:szCs w:val="18"/>
-          <w:lang w:val="es-CO"/>
-        </w:rPr>
-      </w:pPr>
-      <w:r>
-        <w:rPr>
-          <w:rFonts w:ascii="Cambria Math" w:hAnsi="Cambria Math"/>
-          <w:sz w:val="18"/>
-          <w:szCs w:val="18"/>
-          <w:lang w:val="es-CO"/>
-        </w:rPr>
-        <w:t>Pregunta 3:</w:t>
-      </w:r>
-      <w:r>
-        <w:rPr>
-          <w:rFonts w:ascii="Cambria Math" w:hAnsi="Cambria Math"/>
-          <w:sz w:val="18"/>
-          <w:szCs w:val="18"/>
-          <w:lang w:val="es-CO"/>
-        </w:rPr>
-        <w:t xml:space="preserve"> </w:t>
-      </w:r>
-      <w:r>
-        <w:rPr>
-          <w:rFonts w:ascii="Cambria Math" w:hAnsi="Cambria Math"/>
-          <w:sz w:val="18"/>
-          <w:szCs w:val="18"/>
-          <w:lang w:val="es-CO"/>
-        </w:rPr>
-        <w:t xml:space="preserve">Se construyó una base analítica integrada y se generaron variables derivadas para responder las preguntas de negocio. </w:t>
-      </w:r>
-      <w:r>
-        <w:rPr>
-          <w:rFonts w:ascii="Cambria Math" w:hAnsi="Cambria Math"/>
-          <w:sz w:val="18"/>
-          <w:szCs w:val="18"/>
-          <w:lang w:val="es-CO"/>
-        </w:rPr>
-        <w:t>S</w:t>
-      </w:r>
-      <w:r>
-        <w:rPr>
-          <w:rFonts w:ascii="Cambria Math" w:hAnsi="Cambria Math"/>
-          <w:sz w:val="18"/>
-          <w:szCs w:val="18"/>
-          <w:lang w:val="es-CO"/>
-        </w:rPr>
-        <w:t xml:space="preserve">e calcularon, entre otras, </w:t>
-      </w:r>
-      <w:r>
-        <w:rPr>
-          <w:rFonts w:ascii="Cambria Math" w:hAnsi="Cambria Math"/>
-          <w:b/>
-          <w:bCs/>
-          <w:sz w:val="18"/>
-          <w:szCs w:val="18"/>
-          <w:lang w:val="es-CO"/>
-        </w:rPr>
-        <w:t>porcentaje ejecutado, porcentaje pagado, días adicionados, existencia de extensión y contrato prioritario</w:t>
-      </w:r>
-      <w:r>
-        <w:rPr>
-          <w:rFonts w:ascii="Cambria Math" w:hAnsi="Cambria Math"/>
-          <w:sz w:val="18"/>
-          <w:szCs w:val="18"/>
-          <w:lang w:val="es-CO"/>
-        </w:rPr>
-        <w:t>.</w:t>
-      </w:r>
     </w:p>
     <w:p>
       <w:pPr>
@@ -4381,126 +4443,26 @@
         <w:spacing w:before="0"/>
         <w:jc w:val="both"/>
         <w:rPr>
-          <w:rFonts w:ascii="Cambria Math" w:hAnsi="Cambria Math"/>
-          <w:sz w:val="18"/>
-          <w:szCs w:val="18"/>
-          <w:lang w:val="es-CO"/>
-        </w:rPr>
-      </w:pPr>
-      <w:r>
-        <w:rPr>
-          <w:rFonts w:ascii="Cambria Math" w:hAnsi="Cambria Math"/>
-          <w:sz w:val="18"/>
-          <w:szCs w:val="18"/>
-          <w:lang w:val="es-CO"/>
-        </w:rPr>
-        <w:t>4.4 Resultado del proceso</w:t>
-      </w:r>
-    </w:p>
-    <w:p>
-      <w:pPr>
-        <w:jc w:val="both"/>
-        <w:rPr>
-          <w:rFonts w:ascii="Cambria Math" w:hAnsi="Cambria Math"/>
-          <w:sz w:val="18"/>
-          <w:szCs w:val="18"/>
-          <w:lang w:val="es-CO"/>
-        </w:rPr>
-      </w:pPr>
-      <w:r>
-        <w:rPr>
-          <w:rFonts w:ascii="Cambria Math" w:hAnsi="Cambria Math"/>
-          <w:sz w:val="18"/>
-          <w:szCs w:val="18"/>
-          <w:lang w:val="es-CO"/>
-        </w:rPr>
-        <w:t>Pregunta 1:</w:t>
-      </w:r>
-    </w:p>
-    <w:p>
-      <w:pPr>
-        <w:jc w:val="both"/>
-        <w:rPr>
-          <w:rFonts w:ascii="Cambria Math" w:hAnsi="Cambria Math"/>
-          <w:sz w:val="18"/>
-          <w:szCs w:val="18"/>
-          <w:lang w:val="es-CO"/>
-        </w:rPr>
-      </w:pPr>
-      <w:r>
-        <w:rPr>
-          <w:rFonts w:ascii="Cambria Math" w:hAnsi="Cambria Math"/>
-          <w:sz w:val="18"/>
-          <w:szCs w:val="18"/>
-          <w:lang w:val="es-CO"/>
-        </w:rPr>
-        <w:t>Pregunta 2:</w:t>
-      </w:r>
-      <w:r>
-        <w:rPr>
-          <w:rFonts w:ascii="Cambria Math" w:hAnsi="Cambria Math"/>
+          <w:rFonts w:ascii="Cambria Math" w:eastAsiaTheme="minorEastAsia" w:hAnsi="Cambria Math" w:cstheme="minorBidi"/>
           <w:b w:val="0"/>
-          <w:sz w:val="18"/>
-          <w:szCs w:val="18"/>
-          <w:lang w:val="es-CO"/>
-        </w:rPr>
-        <w:t xml:space="preserve"> Se obtuvo una base analítica de 25.605 contratos con las variables territoriales construidas, más los agregados por departamento, año, tipo de contrato y modalidad que consume el tablero. La precisión de la extracción se estimó en 96,7 % sobre una muestra de 60 contratos revisados contra el texto del objeto (58 correctos, 2 dudosos).</w:t>
-      </w:r>
-    </w:p>
-    <w:p>
-      <w:pPr>
-        <w:jc w:val="both"/>
-        <w:rPr>
-          <w:rFonts w:ascii="Cambria Math" w:hAnsi="Cambria Math"/>
-          <w:sz w:val="18"/>
-          <w:szCs w:val="18"/>
-          <w:lang w:val="es-CO"/>
-        </w:rPr>
-      </w:pPr>
-      <w:r>
-        <w:rPr>
-          <w:rFonts w:ascii="Cambria Math" w:hAnsi="Cambria Math"/>
-          <w:sz w:val="18"/>
-          <w:szCs w:val="18"/>
-          <w:lang w:val="es-CO"/>
-        </w:rPr>
-        <w:t>Pregunta 3:</w:t>
-      </w:r>
-      <w:r>
-        <w:rPr>
-          <w:rFonts w:ascii="Cambria Math" w:hAnsi="Cambria Math"/>
-          <w:sz w:val="18"/>
-          <w:szCs w:val="18"/>
-          <w:lang w:val="es-CO"/>
-        </w:rPr>
-        <w:t xml:space="preserve"> </w:t>
-      </w:r>
-      <w:r>
-        <w:rPr>
-          <w:rFonts w:ascii="Cambria Math" w:hAnsi="Cambria Math"/>
-          <w:sz w:val="18"/>
-          <w:szCs w:val="18"/>
-          <w:lang w:val="es-CO"/>
-        </w:rPr>
-        <w:t xml:space="preserve">El proceso produjo bases analíticas listas para exploración, modelamiento y visualización. </w:t>
-      </w:r>
-      <w:r>
-        <w:rPr>
-          <w:rFonts w:ascii="Cambria Math" w:hAnsi="Cambria Math"/>
-          <w:sz w:val="18"/>
-          <w:szCs w:val="18"/>
-          <w:lang w:val="es-CO"/>
-        </w:rPr>
-        <w:t>S</w:t>
-      </w:r>
-      <w:r>
-        <w:rPr>
-          <w:rFonts w:ascii="Cambria Math" w:hAnsi="Cambria Math"/>
-          <w:sz w:val="18"/>
-          <w:szCs w:val="18"/>
-          <w:lang w:val="es-CO"/>
-        </w:rPr>
-        <w:t>e obtuvo una base de 20.718 contratos y 31 variables, utilizada como fuente del análisis y del tablero de ejecución financiera.</w:t>
+          <w:bCs w:val="0"/>
+          <w:color w:val="auto"/>
+          <w:sz w:val="18"/>
+          <w:szCs w:val="18"/>
+          <w:lang w:val="es-CO"/>
+        </w:rPr>
+      </w:pPr>
+      <w:r>
+        <w:rPr>
+          <w:rFonts w:ascii="Cambria Math" w:eastAsiaTheme="minorEastAsia" w:hAnsi="Cambria Math" w:cstheme="minorBidi"/>
+          <w:b w:val="0"/>
+          <w:bCs w:val="0"/>
+          <w:color w:val="auto"/>
+          <w:sz w:val="18"/>
+          <w:szCs w:val="18"/>
+          <w:lang w:val="es-CO"/>
+        </w:rPr>
+        <w:t>Pregunta 3: Se depuraron tipos de datos, faltantes y variables financieras, fechas, estados contractuales y modificaciones de plazo.</w:t>
       </w:r>
     </w:p>
     <w:p>
@@ -4509,7 +4471,10 @@
         <w:spacing w:before="0"/>
         <w:jc w:val="both"/>
         <w:rPr>
-          <w:rFonts w:ascii="Cambria Math" w:hAnsi="Cambria Math"/>
+          <w:rFonts w:ascii="Cambria Math" w:eastAsiaTheme="minorEastAsia" w:hAnsi="Cambria Math" w:cstheme="minorBidi"/>
+          <w:b w:val="0"/>
+          <w:bCs w:val="0"/>
+          <w:color w:val="auto"/>
           <w:sz w:val="18"/>
           <w:szCs w:val="18"/>
           <w:lang w:val="es-CO"/>
@@ -4535,11 +4500,12 @@
           <w:szCs w:val="18"/>
           <w:lang w:val="es-CO"/>
         </w:rPr>
-        <w:t>4.5 Evidencias</w:t>
+        <w:t>4.3 Alistamiento y nuevas características</w:t>
       </w:r>
     </w:p>
     <w:p>
       <w:pPr>
+        <w:spacing w:after="0"/>
         <w:jc w:val="both"/>
         <w:rPr>
           <w:rFonts w:ascii="Cambria Math" w:hAnsi="Cambria Math"/>
@@ -4548,18 +4514,10 @@
           <w:lang w:val="es-CO"/>
         </w:rPr>
       </w:pPr>
-      <w:r>
-        <w:rPr>
-          <w:rFonts w:ascii="Cambria Math" w:hAnsi="Cambria Math"/>
-          <w:sz w:val="18"/>
-          <w:szCs w:val="18"/>
-          <w:lang w:val="es-CO"/>
-        </w:rPr>
-        <w:t>Pregunta 1:</w:t>
-      </w:r>
     </w:p>
     <w:p>
       <w:pPr>
+        <w:spacing w:after="0"/>
         <w:jc w:val="both"/>
         <w:rPr>
           <w:rFonts w:ascii="Cambria Math" w:hAnsi="Cambria Math"/>
@@ -4575,17 +4533,288 @@
           <w:szCs w:val="18"/>
           <w:lang w:val="es-CO"/>
         </w:rPr>
-        <w:t>Pregunta 2:</w:t>
-      </w:r>
-      <w:r>
-        <w:rPr>
-          <w:rFonts w:ascii="Cambria Math" w:hAnsi="Cambria Math"/>
-          <w:b w:val="0"/>
-          <w:sz w:val="18"/>
-          <w:szCs w:val="18"/>
-          <w:lang w:val="es-CO"/>
-        </w:rPr>
-        <w:t xml:space="preserve"> Cuadernos «01_auditoria_territorial_p2.ipynb» (justificación del descarte de las variables geográficas) y «02_construccion_territorial_p2.ipynb» (construcción y validación), más los archivos «df_analitico_p2.csv», «agregado_departamento_p2.csv», «trazabilidad_anual_p2.csv» y «muestra_validacion_p2.csv» con la muestra de validación.</w:t>
+        <w:t>Pregunta 1: Se calcularon CR1, CR5, CR10 y HHI, junto con participaciones por proveedor, modalidad y tipo contractual y concentración acumulada del valor.</w:t>
+      </w:r>
+    </w:p>
+    <w:p>
+      <w:pPr>
+        <w:spacing w:after="0"/>
+        <w:jc w:val="both"/>
+        <w:rPr>
+          <w:rFonts w:ascii="Cambria Math" w:hAnsi="Cambria Math"/>
+          <w:sz w:val="18"/>
+          <w:szCs w:val="18"/>
+          <w:lang w:val="es-CO"/>
+        </w:rPr>
+      </w:pPr>
+    </w:p>
+    <w:p>
+      <w:pPr>
+        <w:spacing w:after="0"/>
+        <w:jc w:val="both"/>
+        <w:rPr>
+          <w:rFonts w:ascii="Cambria Math" w:hAnsi="Cambria Math"/>
+          <w:sz w:val="18"/>
+          <w:szCs w:val="18"/>
+          <w:lang w:val="es-CO"/>
+        </w:rPr>
+      </w:pPr>
+      <w:r>
+        <w:rPr>
+          <w:rFonts w:ascii="Cambria Math" w:hAnsi="Cambria Math"/>
+          <w:sz w:val="18"/>
+          <w:szCs w:val="18"/>
+          <w:lang w:val="es-CO"/>
+        </w:rPr>
+        <w:t>Pregunta 2: Se construyó «departamento_inferido» mediante un diccionario de alias, priorización de coincidencias largas y tratamiento de topónimos ambiguos. Se derivaron indicadores de trazabilidad, número de departamentos y referencias viales.</w:t>
+      </w:r>
+    </w:p>
+    <w:p>
+      <w:pPr>
+        <w:spacing w:after="0"/>
+        <w:jc w:val="both"/>
+        <w:rPr>
+          <w:rFonts w:ascii="Cambria Math" w:hAnsi="Cambria Math"/>
+          <w:sz w:val="18"/>
+          <w:szCs w:val="18"/>
+          <w:lang w:val="es-CO"/>
+        </w:rPr>
+      </w:pPr>
+    </w:p>
+    <w:p>
+      <w:pPr>
+        <w:spacing w:after="0"/>
+        <w:jc w:val="both"/>
+        <w:rPr>
+          <w:rFonts w:ascii="Cambria Math" w:hAnsi="Cambria Math"/>
+          <w:sz w:val="18"/>
+          <w:szCs w:val="18"/>
+          <w:lang w:val="es-CO"/>
+        </w:rPr>
+      </w:pPr>
+      <w:r>
+        <w:rPr>
+          <w:rFonts w:ascii="Cambria Math" w:hAnsi="Cambria Math"/>
+          <w:sz w:val="18"/>
+          <w:szCs w:val="18"/>
+          <w:lang w:val="es-CO"/>
+        </w:rPr>
+        <w:t>Pregunta 3: Se generaron porcentaje ejecutado, porcentaje pagado, recursos pendientes, días adicionados, extensión contractual y contrato prioritario.</w:t>
+      </w:r>
+    </w:p>
+    <w:p>
+      <w:pPr>
+        <w:pStyle w:val="Ttulo2"/>
+        <w:spacing w:before="0"/>
+        <w:jc w:val="both"/>
+        <w:rPr>
+          <w:rFonts w:ascii="Cambria Math" w:hAnsi="Cambria Math"/>
+          <w:sz w:val="18"/>
+          <w:szCs w:val="18"/>
+          <w:lang w:val="es-CO"/>
+        </w:rPr>
+      </w:pPr>
+    </w:p>
+    <w:p>
+      <w:pPr>
+        <w:pStyle w:val="Ttulo2"/>
+        <w:spacing w:before="0"/>
+        <w:jc w:val="both"/>
+        <w:rPr>
+          <w:rFonts w:ascii="Cambria Math" w:hAnsi="Cambria Math"/>
+          <w:sz w:val="18"/>
+          <w:szCs w:val="18"/>
+          <w:lang w:val="es-CO"/>
+        </w:rPr>
+      </w:pPr>
+      <w:r>
+        <w:rPr>
+          <w:rFonts w:ascii="Cambria Math" w:hAnsi="Cambria Math"/>
+          <w:sz w:val="18"/>
+          <w:szCs w:val="18"/>
+          <w:lang w:val="es-CO"/>
+        </w:rPr>
+        <w:t>4.4 Resultado del proceso</w:t>
+      </w:r>
+    </w:p>
+    <w:p>
+      <w:pPr>
+        <w:jc w:val="both"/>
+        <w:rPr>
+          <w:rFonts w:ascii="Cambria Math" w:hAnsi="Cambria Math"/>
+          <w:sz w:val="18"/>
+          <w:szCs w:val="18"/>
+          <w:lang w:val="es-CO"/>
+        </w:rPr>
+      </w:pPr>
+      <w:r>
+        <w:rPr>
+          <w:rFonts w:ascii="Cambria Math" w:hAnsi="Cambria Math"/>
+          <w:sz w:val="18"/>
+          <w:szCs w:val="18"/>
+          <w:lang w:val="es-CO"/>
+        </w:rPr>
+        <w:t>Pregunta 1:</w:t>
+      </w:r>
+      <w:r>
+        <w:rPr>
+          <w:rFonts w:ascii="Cambria Math" w:hAnsi="Cambria Math"/>
+          <w:sz w:val="18"/>
+          <w:szCs w:val="18"/>
+          <w:lang w:val="es-CO"/>
+        </w:rPr>
+        <w:t xml:space="preserve"> </w:t>
+      </w:r>
+      <w:r>
+        <w:rPr>
+          <w:rFonts w:ascii="Cambria Math" w:hAnsi="Cambria Math"/>
+          <w:sz w:val="18"/>
+          <w:szCs w:val="18"/>
+          <w:lang w:val="es-CO"/>
+        </w:rPr>
+        <w:t>Se obtuvo una base analítica preparada para evaluar la concentración de la contratación desde las perspectivas de proveedores, modalidades y tipos de contrato. El resultado permitió generar los indicadores y visualizaciones utilizados para responder la pregunta de negocio.</w:t>
+      </w:r>
+    </w:p>
+    <w:p>
+      <w:pPr>
+        <w:jc w:val="both"/>
+        <w:rPr>
+          <w:rFonts w:ascii="Cambria Math" w:hAnsi="Cambria Math"/>
+          <w:sz w:val="18"/>
+          <w:szCs w:val="18"/>
+          <w:lang w:val="es-CO"/>
+        </w:rPr>
+      </w:pPr>
+      <w:r>
+        <w:rPr>
+          <w:rFonts w:ascii="Cambria Math" w:hAnsi="Cambria Math"/>
+          <w:sz w:val="18"/>
+          <w:szCs w:val="18"/>
+          <w:lang w:val="es-CO"/>
+        </w:rPr>
+        <w:t>Pregunta 2: Se obtuvo una base analítica de 25.605 contratos con las variables territoriales construidas, más los agregados por departamento, año, tipo de contrato y modalidad que consume el tablero. La precisión de la extracción se estimó en 96,7 % sobre una muestra de 60 contratos revisados contra el texto del objeto (58 correctos, 2 dudosos).</w:t>
+      </w:r>
+    </w:p>
+    <w:p>
+      <w:pPr>
+        <w:jc w:val="both"/>
+        <w:rPr>
+          <w:rFonts w:ascii="Cambria Math" w:hAnsi="Cambria Math"/>
+          <w:sz w:val="18"/>
+          <w:szCs w:val="18"/>
+          <w:lang w:val="es-CO"/>
+        </w:rPr>
+      </w:pPr>
+      <w:r>
+        <w:rPr>
+          <w:rFonts w:ascii="Cambria Math" w:hAnsi="Cambria Math"/>
+          <w:sz w:val="18"/>
+          <w:szCs w:val="18"/>
+          <w:lang w:val="es-CO"/>
+        </w:rPr>
+        <w:t>Pregunta 3:</w:t>
+      </w:r>
+      <w:r>
+        <w:rPr>
+          <w:rFonts w:ascii="Cambria Math" w:hAnsi="Cambria Math"/>
+          <w:sz w:val="18"/>
+          <w:szCs w:val="18"/>
+          <w:lang w:val="es-CO"/>
+        </w:rPr>
+        <w:t xml:space="preserve"> El proceso produjo bases analíticas listas para exploración, modelamiento y visualización. Se obtuvo una base de 20.718 contratos y 31 variables, utilizada como fuente del análisis y del tablero de ejecución financiera.</w:t>
+      </w:r>
+    </w:p>
+    <w:p>
+      <w:pPr>
+        <w:pStyle w:val="Ttulo2"/>
+        <w:spacing w:before="0"/>
+        <w:jc w:val="both"/>
+        <w:rPr>
+          <w:rFonts w:ascii="Cambria Math" w:hAnsi="Cambria Math"/>
+          <w:sz w:val="18"/>
+          <w:szCs w:val="18"/>
+          <w:lang w:val="es-CO"/>
+        </w:rPr>
+      </w:pPr>
+    </w:p>
+    <w:p>
+      <w:pPr>
+        <w:pStyle w:val="Ttulo2"/>
+        <w:spacing w:before="0"/>
+        <w:jc w:val="both"/>
+        <w:rPr>
+          <w:rFonts w:ascii="Cambria Math" w:hAnsi="Cambria Math"/>
+          <w:sz w:val="18"/>
+          <w:szCs w:val="18"/>
+          <w:lang w:val="es-CO"/>
+        </w:rPr>
+      </w:pPr>
+      <w:r>
+        <w:rPr>
+          <w:rFonts w:ascii="Cambria Math" w:hAnsi="Cambria Math"/>
+          <w:sz w:val="18"/>
+          <w:szCs w:val="18"/>
+          <w:lang w:val="es-CO"/>
+        </w:rPr>
+        <w:t>4.5 Evidencias</w:t>
+      </w:r>
+    </w:p>
+    <w:p>
+      <w:pPr>
+        <w:jc w:val="both"/>
+        <w:rPr>
+          <w:rFonts w:ascii="Cambria Math" w:hAnsi="Cambria Math"/>
+          <w:sz w:val="18"/>
+          <w:szCs w:val="18"/>
+          <w:lang w:val="es-CO"/>
+        </w:rPr>
+      </w:pPr>
+      <w:r>
+        <w:rPr>
+          <w:rFonts w:ascii="Cambria Math" w:hAnsi="Cambria Math"/>
+          <w:sz w:val="18"/>
+          <w:szCs w:val="18"/>
+          <w:lang w:val="es-CO"/>
+        </w:rPr>
+        <w:t>Pregunta 1:</w:t>
+      </w:r>
+      <w:r>
+        <w:rPr>
+          <w:rFonts w:ascii="Cambria Math" w:hAnsi="Cambria Math"/>
+          <w:sz w:val="18"/>
+          <w:szCs w:val="18"/>
+          <w:lang w:val="es-CO"/>
+        </w:rPr>
+        <w:t xml:space="preserve"> </w:t>
+      </w:r>
+      <w:r>
+        <w:rPr>
+          <w:rFonts w:ascii="Cambria Math" w:hAnsi="Cambria Math"/>
+          <w:sz w:val="18"/>
+          <w:szCs w:val="18"/>
+          <w:lang w:val="es-CO"/>
+        </w:rPr>
+        <w:t>Se documentaron las etapas de auditoría, limpieza y alistamiento mediante notebooks de Python y archivos de datos resultantes. Las evidencias incluyen los análisis utilizados para construir los indicadores de concentración y el tablero desarrollado para su visualización.</w:t>
+      </w:r>
+    </w:p>
+    <w:p>
+      <w:pPr>
+        <w:jc w:val="both"/>
+        <w:rPr>
+          <w:rFonts w:ascii="Cambria Math" w:hAnsi="Cambria Math"/>
+          <w:sz w:val="18"/>
+          <w:szCs w:val="18"/>
+          <w:lang w:val="es-CO"/>
+        </w:rPr>
+      </w:pPr>
+      <w:r>
+        <w:rPr>
+          <w:rFonts w:ascii="Cambria Math" w:hAnsi="Cambria Math"/>
+          <w:sz w:val="18"/>
+          <w:szCs w:val="18"/>
+          <w:lang w:val="es-CO"/>
+        </w:rPr>
+        <w:t>Pregunta 2: Cuadernos «01_auditoria_territorial_p2.ipynb» (justificación del descarte de las variables geográficas) y «02_construccion_territorial_p2.ipynb» (construcción y validación), más los archivos «df_analitico_p2.csv», «agregado_departamento_p2.csv», «trazabilidad_anual_p2.csv» y «muestra_validacion_p2.csv» con la muestra de validación.</w:t>
       </w:r>
     </w:p>
     <w:p>
@@ -4894,6 +5123,24 @@
         </w:rPr>
         <w:t>Pregunta 1:</w:t>
       </w:r>
+      <w:r>
+        <w:rPr>
+          <w:rFonts w:ascii="Cambria Math" w:hAnsi="Cambria Math"/>
+          <w:sz w:val="18"/>
+          <w:szCs w:val="18"/>
+          <w:lang w:val="es-CO"/>
+        </w:rPr>
+        <w:t xml:space="preserve"> </w:t>
+      </w:r>
+      <w:r>
+        <w:rPr>
+          <w:rFonts w:ascii="Cambria Math" w:hAnsi="Cambria Math"/>
+          <w:sz w:val="18"/>
+          <w:szCs w:val="18"/>
+          <w:lang w:val="es-CO"/>
+        </w:rPr>
+        <w:t>Se diseñó una visualización orientada a identificar rápidamente la concentración por proveedores, modalidades y tipos de contrato, priorizando indicadores comparables y de fácil interpretación para la toma de decisiones.</w:t>
+      </w:r>
     </w:p>
     <w:p>
       <w:pPr>
@@ -4912,17 +5159,7 @@
           <w:szCs w:val="18"/>
           <w:lang w:val="es-CO"/>
         </w:rPr>
-        <w:t>Pregunta 2:</w:t>
-      </w:r>
-      <w:r>
-        <w:rPr>
-          <w:rFonts w:ascii="Cambria Math" w:hAnsi="Cambria Math"/>
-          <w:b w:val="0"/>
-          <w:sz w:val="18"/>
-          <w:szCs w:val="18"/>
-          <w:lang w:val="es-CO"/>
-        </w:rPr>
-        <w:t xml:space="preserve"> Diseño orientado a responder dónde se ejecutan los recursos sin ocultar cuánto de eso es verificable. El indicador de cobertura territorial va en la fila superior de KPI y no en una nota al pie, porque un mapa que presenta el 77,9 % del valor como si fuera el total induce a error a quien decide.</w:t>
+        <w:t>Pregunta 2: Diseño orientado a responder dónde se ejecutan los recursos sin ocultar cuánto de eso es verificable. El indicador de cobertura territorial va en la fila superior de KPI y no en una nota al pie, porque un mapa que presenta el 77,9 % del valor como si fuera el total induce a error a quien decide.</w:t>
       </w:r>
     </w:p>
     <w:p>
@@ -4952,16 +5189,7 @@
           <w:szCs w:val="18"/>
           <w:lang w:val="es-CO"/>
         </w:rPr>
-        <w:t xml:space="preserve"> </w:t>
-      </w:r>
-      <w:r>
-        <w:rPr>
-          <w:rFonts w:ascii="Cambria Math" w:hAnsi="Cambria Math"/>
-          <w:sz w:val="18"/>
-          <w:szCs w:val="18"/>
-          <w:lang w:val="es-CO"/>
-        </w:rPr>
-        <w:t>Diseño orientado al seguimiento de la ejecución financiera, recursos pendientes, extensiones contractuales y contratos prioritarios.</w:t>
+        <w:t xml:space="preserve"> Diseño orientado al seguimiento de la ejecución financiera, recursos pendientes, extensiones contractuales y contratos prioritarios.</w:t>
       </w:r>
     </w:p>
     <w:p>
@@ -5043,6 +5271,24 @@
         </w:rPr>
         <w:t>Pregunta 1:</w:t>
       </w:r>
+      <w:r>
+        <w:rPr>
+          <w:rFonts w:ascii="Cambria Math" w:hAnsi="Cambria Math"/>
+          <w:sz w:val="18"/>
+          <w:szCs w:val="18"/>
+          <w:lang w:val="es-CO"/>
+        </w:rPr>
+        <w:t xml:space="preserve"> </w:t>
+      </w:r>
+      <w:r>
+        <w:rPr>
+          <w:rFonts w:ascii="Cambria Math" w:hAnsi="Cambria Math"/>
+          <w:sz w:val="18"/>
+          <w:szCs w:val="18"/>
+          <w:lang w:val="es-CO"/>
+        </w:rPr>
+        <w:t>Se implementó el módulo de Pregunta 1 en Dash, incorporando indicadores de concentración, visualizaciones y filtros para explorar la distribución del valor contratado y el número de contratos.</w:t>
+      </w:r>
     </w:p>
     <w:p>
       <w:pPr>
@@ -5061,17 +5307,7 @@
           <w:szCs w:val="18"/>
           <w:lang w:val="es-CO"/>
         </w:rPr>
-        <w:t>Pregunta 2:</w:t>
-      </w:r>
-      <w:r>
-        <w:rPr>
-          <w:rFonts w:ascii="Cambria Math" w:hAnsi="Cambria Math"/>
-          <w:b w:val="0"/>
-          <w:sz w:val="18"/>
-          <w:szCs w:val="18"/>
-          <w:lang w:val="es-CO"/>
-        </w:rPr>
-        <w:t xml:space="preserve"> Módulo «territorial.py» con cuatro indicadores, filtros por rango de años, tipo de contrato y modalidad, mapa coroplético de Colombia, ranking de departamentos y dos series de tiempo. El mapa usa Choroplethmapbox sobre fondo plano en lugar de Choropleth, porque este último descarga la geometría desde un CDN externo y deja el mapa en blanco si la instancia no tiene salida a internet.</w:t>
+        <w:t>Pregunta 2: Módulo «territorial.py» con cuatro indicadores, filtros por rango de años, tipo de contrato y modalidad, mapa coroplético de Colombia, ranking de departamentos y dos series de tiempo. El mapa usa Choroplethmapbox sobre fondo plano en lugar de Choropleth, porque este último descarga la geometría desde un CDN externo y deja el mapa en blanco si la instancia no tiene salida a internet.</w:t>
       </w:r>
     </w:p>
     <w:p>
@@ -5101,16 +5337,7 @@
           <w:szCs w:val="18"/>
           <w:lang w:val="es-CO"/>
         </w:rPr>
-        <w:t xml:space="preserve"> </w:t>
-      </w:r>
-      <w:r>
-        <w:rPr>
-          <w:rFonts w:ascii="Cambria Math" w:hAnsi="Cambria Math"/>
-          <w:sz w:val="18"/>
-          <w:szCs w:val="18"/>
-          <w:lang w:val="es-CO"/>
-        </w:rPr>
-        <w:t>Implementación de filtros por estado, tipo, modalidad, extensión y nivel de ejecución; KPI dinámicos, gráficos financieros y tabla de contratos.</w:t>
+        <w:t xml:space="preserve"> Implementación de filtros por estado, tipo, modalidad, extensión y nivel de ejecución; KPI dinámicos, gráficos financieros y tabla de contratos.</w:t>
       </w:r>
     </w:p>
     <w:p>
@@ -5175,6 +5402,7 @@
     </w:p>
     <w:p>
       <w:pPr>
+        <w:spacing w:after="0"/>
         <w:jc w:val="both"/>
         <w:rPr>
           <w:rFonts w:ascii="Cambria Math" w:hAnsi="Cambria Math"/>
@@ -5186,15 +5414,15 @@
       <w:r>
         <w:rPr>
           <w:rFonts w:ascii="Cambria Math" w:hAnsi="Cambria Math"/>
-          <w:sz w:val="18"/>
-          <w:szCs w:val="18"/>
-          <w:lang w:val="es-CO"/>
-        </w:rPr>
-        <w:t>Pregunta 1:</w:t>
+          <w:sz w:val="17"/>
+          <w:lang w:val="es-CO"/>
+        </w:rPr>
+        <w:t>Pregunta 1: Integrado al tablero general para facilitar el análisis conjunto de la contratación de INVIAS.</w:t>
       </w:r>
     </w:p>
     <w:p>
       <w:pPr>
+        <w:spacing w:after="0"/>
         <w:jc w:val="both"/>
         <w:rPr>
           <w:rFonts w:ascii="Cambria Math" w:hAnsi="Cambria Math"/>
@@ -5206,25 +5434,115 @@
       <w:r>
         <w:rPr>
           <w:rFonts w:ascii="Cambria Math" w:hAnsi="Cambria Math"/>
-          <w:sz w:val="18"/>
-          <w:szCs w:val="18"/>
-          <w:lang w:val="es-CO"/>
-        </w:rPr>
-        <w:t>Pregunta 2:</w:t>
-      </w:r>
-      <w:r>
-        <w:rPr>
-          <w:rFonts w:ascii="Cambria Math" w:hAnsi="Cambria Math"/>
-          <w:b w:val="0"/>
-          <w:sz w:val="18"/>
-          <w:szCs w:val="18"/>
-          <w:lang w:val="es-CO"/>
-        </w:rPr>
-        <w:t xml:space="preserve"> Módulo de distribución y trazabilidad territorial. Se construyó además la aplicación contenedora «app.py», que registra las tres pestañas y permite que cada integrante trabaje sobre su módulo sin bloquear a los demás, y se integró el módulo de la Pregunta 3 a esa estructura.</w:t>
+          <w:sz w:val="17"/>
+          <w:lang w:val="es-CO"/>
+        </w:rPr>
+        <w:t>Pregunta 2: Integrado mediante «app.py», que registra las tres pestañas y permite trabajar cada módulo de forma independiente.</w:t>
       </w:r>
     </w:p>
     <w:p>
       <w:pPr>
+        <w:spacing w:after="0"/>
+        <w:jc w:val="both"/>
+        <w:rPr>
+          <w:rFonts w:ascii="Cambria Math" w:hAnsi="Cambria Math"/>
+          <w:sz w:val="18"/>
+          <w:szCs w:val="18"/>
+          <w:lang w:val="es-CO"/>
+        </w:rPr>
+      </w:pPr>
+      <w:r>
+        <w:rPr>
+          <w:rFonts w:ascii="Cambria Math" w:hAnsi="Cambria Math"/>
+          <w:sz w:val="17"/>
+          <w:lang w:val="es-CO"/>
+        </w:rPr>
+        <w:t>Pregunta 3: Integrado como módulo de ejecución financiera y modificaciones contractuales.</w:t>
+      </w:r>
+    </w:p>
+    <w:p>
+      <w:pPr>
+        <w:pStyle w:val="Ttulo2"/>
+        <w:jc w:val="both"/>
+        <w:rPr>
+          <w:rFonts w:ascii="Cambria Math" w:hAnsi="Cambria Math"/>
+          <w:sz w:val="18"/>
+          <w:szCs w:val="18"/>
+          <w:lang w:val="es-CO"/>
+        </w:rPr>
+      </w:pPr>
+      <w:r>
+        <w:rPr>
+          <w:rFonts w:ascii="Cambria Math" w:hAnsi="Cambria Math"/>
+          <w:sz w:val="18"/>
+          <w:szCs w:val="18"/>
+          <w:lang w:val="es-CO"/>
+        </w:rPr>
+        <w:t>5.4 Validación y ajustes</w:t>
+      </w:r>
+    </w:p>
+    <w:p>
+      <w:pPr>
+        <w:jc w:val="both"/>
+        <w:rPr>
+          <w:rFonts w:ascii="Cambria Math" w:hAnsi="Cambria Math"/>
+          <w:sz w:val="18"/>
+          <w:szCs w:val="18"/>
+          <w:lang w:val="es-CO"/>
+        </w:rPr>
+      </w:pPr>
+      <w:r>
+        <w:rPr>
+          <w:rFonts w:ascii="Cambria Math" w:hAnsi="Cambria Math"/>
+          <w:sz w:val="18"/>
+          <w:szCs w:val="18"/>
+          <w:lang w:val="es-CO"/>
+        </w:rPr>
+        <w:t>Se realizaron pruebas funcionales de filtros, visualizaciones, navegación e interacción, ajustando los componentes para garantizar consistencia entre los resultados analíticos y el tablero.</w:t>
+      </w:r>
+    </w:p>
+    <w:p>
+      <w:pPr>
+        <w:spacing w:after="0"/>
+        <w:jc w:val="both"/>
+        <w:rPr>
+          <w:rFonts w:ascii="Cambria Math" w:hAnsi="Cambria Math"/>
+          <w:sz w:val="18"/>
+          <w:szCs w:val="18"/>
+          <w:lang w:val="es-CO"/>
+        </w:rPr>
+      </w:pPr>
+      <w:r>
+        <w:rPr>
+          <w:rFonts w:ascii="Cambria Math" w:hAnsi="Cambria Math"/>
+          <w:sz w:val="17"/>
+          <w:lang w:val="es-CO"/>
+        </w:rPr>
+        <w:t>Pregunta 1: Se validaron indicadores, filtros y visualizaciones y se ajustaron aspectos de presentación y usabilidad.</w:t>
+      </w:r>
+    </w:p>
+    <w:p>
+      <w:pPr>
+        <w:spacing w:after="0"/>
+        <w:jc w:val="both"/>
+        <w:rPr>
+          <w:rFonts w:ascii="Cambria Math" w:hAnsi="Cambria Math"/>
+          <w:sz w:val="18"/>
+          <w:szCs w:val="18"/>
+          <w:lang w:val="es-CO"/>
+        </w:rPr>
+      </w:pPr>
+      <w:r>
+        <w:rPr>
+          <w:rFonts w:ascii="Cambria Math" w:hAnsi="Cambria Math"/>
+          <w:sz w:val="17"/>
+          <w:lang w:val="es-CO"/>
+        </w:rPr>
+        <w:t>Pregunta 2: Se verificó el funcionamiento sin dependencias externas y la consistencia de la cobertura territorial mostrada en el tablero.</w:t>
+      </w:r>
+    </w:p>
+    <w:p>
+      <w:pPr>
         <w:spacing w:after="80"/>
         <w:jc w:val="both"/>
         <w:rPr>
@@ -5237,48 +5555,10 @@
       <w:r>
         <w:rPr>
           <w:rFonts w:ascii="Cambria Math" w:hAnsi="Cambria Math"/>
-          <w:sz w:val="18"/>
-          <w:szCs w:val="18"/>
-          <w:lang w:val="es-CO"/>
-        </w:rPr>
-        <w:t>Pregunta 3:</w:t>
-      </w:r>
-      <w:r>
-        <w:rPr>
-          <w:rFonts w:ascii="Cambria Math" w:hAnsi="Cambria Math"/>
-          <w:sz w:val="18"/>
-          <w:szCs w:val="18"/>
-          <w:lang w:val="es-CO"/>
-        </w:rPr>
-        <w:t xml:space="preserve"> </w:t>
-      </w:r>
-      <w:r>
-        <w:rPr>
-          <w:rFonts w:ascii="Cambria Math" w:hAnsi="Cambria Math"/>
-          <w:sz w:val="18"/>
-          <w:szCs w:val="18"/>
-          <w:lang w:val="es-CO"/>
-        </w:rPr>
-        <w:t xml:space="preserve">Módulo de </w:t>
-      </w:r>
-      <w:r>
-        <w:rPr>
-          <w:rStyle w:val="Fuerte"/>
-          <w:rFonts w:ascii="Cambria Math" w:hAnsi="Cambria Math"/>
-          <w:sz w:val="18"/>
-          <w:szCs w:val="18"/>
-          <w:lang w:val="es-CO"/>
-        </w:rPr>
-        <w:t>ejecución financiera y modificaciones contractuales</w:t>
-      </w:r>
-      <w:r>
-        <w:rPr>
-          <w:rFonts w:ascii="Cambria Math" w:hAnsi="Cambria Math"/>
-          <w:sz w:val="18"/>
-          <w:szCs w:val="18"/>
-          <w:lang w:val="es-CO"/>
-        </w:rPr>
-        <w:t>.</w:t>
+          <w:sz w:val="17"/>
+          <w:lang w:val="es-CO"/>
+        </w:rPr>
+        <w:t>Pregunta 3: Se validaron filtros, KPI, gráficos, tabla y regla de priorización, ajustando el filtro de nivel de ejecución y la ayuda al usuario.</w:t>
       </w:r>
     </w:p>
     <w:p>
@@ -5299,7 +5579,7 @@
           <w:szCs w:val="18"/>
           <w:lang w:val="es-CO"/>
         </w:rPr>
-        <w:t>5.4 Validación y ajustes</w:t>
+        <w:t>5.5 Resultado</w:t>
       </w:r>
     </w:p>
     <w:p>
@@ -5319,11 +5599,31 @@
           <w:szCs w:val="18"/>
           <w:lang w:val="es-CO"/>
         </w:rPr>
-        <w:t>Se realizaron pruebas funcionales de filtros, visualizaciones, navegación e interacción, ajustando los componentes para garantizar consistencia entre los resultados analíticos y el tablero.</w:t>
+        <w:t xml:space="preserve">Se obtuvo un </w:t>
+      </w:r>
+      <w:r>
+        <w:rPr>
+          <w:rStyle w:val="Fuerte"/>
+          <w:rFonts w:ascii="Cambria Math" w:hAnsi="Cambria Math"/>
+          <w:sz w:val="18"/>
+          <w:szCs w:val="18"/>
+          <w:lang w:val="es-CO"/>
+        </w:rPr>
+        <w:t>tablero interactivo unificado en Dash</w:t>
+      </w:r>
+      <w:r>
+        <w:rPr>
+          <w:rFonts w:ascii="Cambria Math" w:hAnsi="Cambria Math"/>
+          <w:sz w:val="18"/>
+          <w:szCs w:val="18"/>
+          <w:lang w:val="es-CO"/>
+        </w:rPr>
+        <w:t xml:space="preserve"> que permite explorar los resultados de las tres preguntas de negocio y facilita la consulta de información mediante filtros y visualizaciones dinámicas.</w:t>
       </w:r>
     </w:p>
     <w:p>
       <w:pPr>
+        <w:spacing w:after="0"/>
         <w:jc w:val="both"/>
         <w:rPr>
           <w:rFonts w:ascii="Cambria Math" w:hAnsi="Cambria Math"/>
@@ -5335,15 +5635,15 @@
       <w:r>
         <w:rPr>
           <w:rFonts w:ascii="Cambria Math" w:hAnsi="Cambria Math"/>
-          <w:sz w:val="18"/>
-          <w:szCs w:val="18"/>
-          <w:lang w:val="es-CO"/>
-        </w:rPr>
-        <w:t>Pregunta 1:</w:t>
+          <w:sz w:val="17"/>
+          <w:lang w:val="es-CO"/>
+        </w:rPr>
+        <w:t>Pregunta 1: Permite comparar patrones de concentración por proveedor, modalidad y tipo contractual.</w:t>
       </w:r>
     </w:p>
     <w:p>
       <w:pPr>
+        <w:spacing w:after="0"/>
         <w:jc w:val="both"/>
         <w:rPr>
           <w:rFonts w:ascii="Cambria Math" w:hAnsi="Cambria Math"/>
@@ -5355,26 +5655,15 @@
       <w:r>
         <w:rPr>
           <w:rFonts w:ascii="Cambria Math" w:hAnsi="Cambria Math"/>
-          <w:sz w:val="18"/>
-          <w:szCs w:val="18"/>
-          <w:lang w:val="es-CO"/>
-        </w:rPr>
-        <w:t>Pregunta 2:</w:t>
-      </w:r>
-      <w:r>
-        <w:rPr>
-          <w:rFonts w:ascii="Cambria Math" w:hAnsi="Cambria Math"/>
-          <w:b w:val="0"/>
-          <w:sz w:val="18"/>
-          <w:szCs w:val="18"/>
-          <w:lang w:val="es-CO"/>
-        </w:rPr>
-        <w:t xml:space="preserve"> Se verificó que el tablero no realiza peticiones a servidores externos, requisito para que funcione en la instancia de EC2. Se corrigió una discrepancia entre el tablero y el informe: 2.374 contratos no tienen fecha de firma y el filtro de año los descartaba en silencio, lo que subía la cobertura de 77,9 % a 88,2 %. Ahora se incluyen por defecto mediante una casilla explícita.</w:t>
+          <w:sz w:val="17"/>
+          <w:lang w:val="es-CO"/>
+        </w:rPr>
+        <w:t>Pregunta 2: Permite consultar la distribución territorial del gasto y su nivel de trazabilidad.</w:t>
       </w:r>
     </w:p>
     <w:p>
       <w:pPr>
-        <w:spacing w:after="80"/>
+        <w:spacing w:after="0"/>
         <w:jc w:val="both"/>
         <w:rPr>
           <w:rFonts w:ascii="Cambria Math" w:hAnsi="Cambria Math"/>
@@ -5386,206 +5675,10 @@
       <w:r>
         <w:rPr>
           <w:rFonts w:ascii="Cambria Math" w:hAnsi="Cambria Math"/>
-          <w:sz w:val="18"/>
-          <w:szCs w:val="18"/>
-          <w:lang w:val="es-CO"/>
-        </w:rPr>
-        <w:t>Pregunta 3:</w:t>
-      </w:r>
-      <w:r>
-        <w:rPr>
-          <w:rFonts w:ascii="Cambria Math" w:hAnsi="Cambria Math"/>
-          <w:sz w:val="18"/>
-          <w:szCs w:val="18"/>
-          <w:lang w:val="es-CO"/>
-        </w:rPr>
-        <w:t xml:space="preserve"> </w:t>
-      </w:r>
-      <w:r>
-        <w:rPr>
-          <w:rFonts w:ascii="Cambria Math" w:hAnsi="Cambria Math"/>
-          <w:sz w:val="18"/>
-          <w:szCs w:val="18"/>
-          <w:lang w:val="es-CO"/>
-        </w:rPr>
-        <w:t>Validación de filtros, KPI, gráficos, tabla de contratos y regla de priorización; se corrigió el funcionamiento del filtro de nivel de ejecución y se incorporó una ventana de ayuda al usuario.</w:t>
-      </w:r>
-    </w:p>
-    <w:p>
-      <w:pPr>
-        <w:pStyle w:val="Ttulo2"/>
-        <w:jc w:val="both"/>
-        <w:rPr>
-          <w:rFonts w:ascii="Cambria Math" w:hAnsi="Cambria Math"/>
-          <w:sz w:val="18"/>
-          <w:szCs w:val="18"/>
-          <w:lang w:val="es-CO"/>
-        </w:rPr>
-      </w:pPr>
-      <w:r>
-        <w:rPr>
-          <w:rFonts w:ascii="Cambria Math" w:hAnsi="Cambria Math"/>
-          <w:sz w:val="18"/>
-          <w:szCs w:val="18"/>
-          <w:lang w:val="es-CO"/>
-        </w:rPr>
-        <w:t>5.5 Resultado</w:t>
-      </w:r>
-    </w:p>
-    <w:p>
-      <w:pPr>
-        <w:jc w:val="both"/>
-        <w:rPr>
-          <w:rFonts w:ascii="Cambria Math" w:hAnsi="Cambria Math"/>
-          <w:sz w:val="18"/>
-          <w:szCs w:val="18"/>
-          <w:lang w:val="es-CO"/>
-        </w:rPr>
-      </w:pPr>
-      <w:r>
-        <w:rPr>
-          <w:rFonts w:ascii="Cambria Math" w:hAnsi="Cambria Math"/>
-          <w:sz w:val="18"/>
-          <w:szCs w:val="18"/>
-          <w:lang w:val="es-CO"/>
-        </w:rPr>
-        <w:t xml:space="preserve">Se obtuvo un </w:t>
-      </w:r>
-      <w:r>
-        <w:rPr>
-          <w:rStyle w:val="Fuerte"/>
-          <w:rFonts w:ascii="Cambria Math" w:hAnsi="Cambria Math"/>
-          <w:sz w:val="18"/>
-          <w:szCs w:val="18"/>
-          <w:lang w:val="es-CO"/>
-        </w:rPr>
-        <w:t>tablero interactivo unificado en Dash</w:t>
-      </w:r>
-      <w:r>
-        <w:rPr>
-          <w:rFonts w:ascii="Cambria Math" w:hAnsi="Cambria Math"/>
-          <w:sz w:val="18"/>
-          <w:szCs w:val="18"/>
-          <w:lang w:val="es-CO"/>
-        </w:rPr>
-        <w:t xml:space="preserve"> que permite explorar los resultados de las tres preguntas de negocio y facilita la consulta de información mediante filtros y visualizaciones </w:t>
-      </w:r>
-      <w:proofErr w:type="spellStart"/>
-      <w:r>
-        <w:rPr>
-          <w:rFonts w:ascii="Cambria Math" w:hAnsi="Cambria Math"/>
-          <w:sz w:val="18"/>
-          <w:szCs w:val="18"/>
-          <w:lang w:val="es-CO"/>
-        </w:rPr>
-        <w:t>dinámicas.</w:t>
-      </w:r>
-      <w:r>
-        <w:rPr>
-          <w:rFonts w:ascii="Cambria Math" w:hAnsi="Cambria Math"/>
-          <w:sz w:val="18"/>
-          <w:szCs w:val="18"/>
-          <w:lang w:val="es-CO"/>
-        </w:rPr>
-        <w:t>Pregunta</w:t>
-      </w:r>
-      <w:proofErr w:type="spellEnd"/>
-      <w:r>
-        <w:rPr>
-          <w:rFonts w:ascii="Cambria Math" w:hAnsi="Cambria Math"/>
-          <w:sz w:val="18"/>
-          <w:szCs w:val="18"/>
-          <w:lang w:val="es-CO"/>
-        </w:rPr>
-        <w:t xml:space="preserve"> 1:</w:t>
-      </w:r>
-    </w:p>
-    <w:p>
-      <w:pPr>
-        <w:jc w:val="both"/>
-        <w:rPr>
-          <w:rFonts w:ascii="Cambria Math" w:hAnsi="Cambria Math"/>
-          <w:sz w:val="18"/>
-          <w:szCs w:val="18"/>
-          <w:lang w:val="es-CO"/>
-        </w:rPr>
-      </w:pPr>
-      <w:r>
-        <w:rPr>
-          <w:rFonts w:ascii="Cambria Math" w:hAnsi="Cambria Math"/>
-          <w:sz w:val="18"/>
-          <w:szCs w:val="18"/>
-          <w:lang w:val="es-CO"/>
-        </w:rPr>
-        <w:t>Pregunta 2:</w:t>
-      </w:r>
-      <w:r>
-        <w:rPr>
-          <w:rFonts w:ascii="Cambria Math" w:hAnsi="Cambria Math"/>
-          <w:b w:val="0"/>
-          <w:sz w:val="18"/>
-          <w:szCs w:val="18"/>
-          <w:lang w:val="es-CO"/>
-        </w:rPr>
-        <w:t xml:space="preserve"> Módulo que permite consultar la distribución territorial del gasto por departamento y año, junto con el nivel de trazabilidad de la información que se está consultando.</w:t>
-      </w:r>
-    </w:p>
-    <w:p>
-      <w:pPr>
-        <w:spacing w:after="80"/>
-        <w:jc w:val="both"/>
-        <w:rPr>
-          <w:rFonts w:ascii="Cambria Math" w:hAnsi="Cambria Math"/>
-          <w:sz w:val="18"/>
-          <w:szCs w:val="18"/>
-          <w:lang w:val="es-CO"/>
-        </w:rPr>
-      </w:pPr>
-      <w:r>
-        <w:rPr>
-          <w:rFonts w:ascii="Cambria Math" w:hAnsi="Cambria Math"/>
-          <w:sz w:val="18"/>
-          <w:szCs w:val="18"/>
-          <w:lang w:val="es-CO"/>
-        </w:rPr>
-        <w:t>Pregunta 3:</w:t>
-      </w:r>
-      <w:r>
-        <w:rPr>
-          <w:rFonts w:ascii="Cambria Math" w:hAnsi="Cambria Math"/>
-          <w:sz w:val="18"/>
-          <w:szCs w:val="18"/>
-          <w:lang w:val="es-CO"/>
-        </w:rPr>
-        <w:t xml:space="preserve"> </w:t>
-      </w:r>
-      <w:r>
-        <w:rPr>
-          <w:rFonts w:ascii="Cambria Math" w:hAnsi="Cambria Math"/>
-          <w:sz w:val="18"/>
-          <w:szCs w:val="18"/>
-          <w:lang w:val="es-CO"/>
-        </w:rPr>
-        <w:t xml:space="preserve">Herramienta para analizar la </w:t>
-      </w:r>
-      <w:r>
-        <w:rPr>
-          <w:rStyle w:val="Fuerte"/>
-          <w:rFonts w:ascii="Cambria Math" w:hAnsi="Cambria Math"/>
-          <w:sz w:val="18"/>
-          <w:szCs w:val="18"/>
-          <w:lang w:val="es-CO"/>
-        </w:rPr>
-        <w:t>ejecución financiera y priorizar contratos para seguimiento</w:t>
-      </w:r>
-      <w:r>
-        <w:rPr>
-          <w:rFonts w:ascii="Cambria Math" w:hAnsi="Cambria Math"/>
-          <w:sz w:val="18"/>
-          <w:szCs w:val="18"/>
-          <w:lang w:val="es-CO"/>
-        </w:rPr>
-        <w:t>, incluyendo detalle contractual.</w:t>
+          <w:sz w:val="17"/>
+          <w:lang w:val="es-CO"/>
+        </w:rPr>
+        <w:t>Pregunta 3: Permite analizar la ejecución financiera y priorizar contratos para seguimiento.</w:t>
       </w:r>
     </w:p>
     <w:p>
@@ -5793,13 +5886,15 @@
           <w:rFonts w:ascii="Cambria Math" w:hAnsi="Cambria Math"/>
           <w:sz w:val="18"/>
           <w:szCs w:val="18"/>
-        </w:rPr>
-      </w:pPr>
-      <w:r>
-        <w:rPr>
-          <w:rFonts w:ascii="Cambria Math" w:hAnsi="Cambria Math"/>
-          <w:sz w:val="18"/>
-          <w:szCs w:val="18"/>
+          <w:lang w:val="es-CO"/>
+        </w:rPr>
+      </w:pPr>
+      <w:r>
+        <w:rPr>
+          <w:rFonts w:ascii="Cambria Math" w:hAnsi="Cambria Math"/>
+          <w:sz w:val="18"/>
+          <w:szCs w:val="18"/>
+          <w:lang w:val="es-CO"/>
         </w:rPr>
         <w:t>6.1 Preparación del entorno</w:t>
       </w:r>
@@ -5822,7 +5917,7 @@
           <w:szCs w:val="18"/>
           <w:lang w:val="es-CO"/>
         </w:rPr>
-        <w:t>[Describir los pasos realizados en AWS EC2, ejecución, verificación, mantenimiento y evidencias.]</w:t>
+        <w:t>Se definió la estructura de despliegue del dashboard, incluyendo la aplicación principal, módulos, archivos de datos y dependencias necesarias para su ejecución. La solución fue preparada buscando facilitar su posterior implementación en un entorno AWS EC2.</w:t>
       </w:r>
     </w:p>
     <w:p>
@@ -5848,6 +5943,102 @@
     </w:p>
     <w:p>
       <w:pPr>
+        <w:pStyle w:val="Ttulo2"/>
+        <w:jc w:val="both"/>
+        <w:rPr>
+          <w:rFonts w:ascii="Cambria Math" w:eastAsiaTheme="minorEastAsia" w:hAnsi="Cambria Math" w:cstheme="minorBidi"/>
+          <w:b w:val="0"/>
+          <w:bCs w:val="0"/>
+          <w:color w:val="auto"/>
+          <w:sz w:val="18"/>
+          <w:szCs w:val="18"/>
+          <w:lang w:val="es-CO"/>
+        </w:rPr>
+      </w:pPr>
+      <w:r>
+        <w:rPr>
+          <w:rFonts w:ascii="Cambria Math" w:eastAsiaTheme="minorEastAsia" w:hAnsi="Cambria Math" w:cstheme="minorBidi"/>
+          <w:b w:val="0"/>
+          <w:bCs w:val="0"/>
+          <w:color w:val="auto"/>
+          <w:sz w:val="18"/>
+          <w:szCs w:val="18"/>
+          <w:lang w:val="es-CO"/>
+        </w:rPr>
+        <w:t>Se estableció el procedimiento para ejecutar el dashboard en un servidor EC2, considerando la instalación de dependencias, configuración del entorno y puesta en ejecución de la aplicación Dash. El procedimiento queda documentado para facilitar su implementación posterior.</w:t>
+      </w:r>
+    </w:p>
+    <w:p>
+      <w:pPr>
+        <w:pStyle w:val="Ttulo2"/>
+        <w:jc w:val="both"/>
+        <w:rPr>
+          <w:rFonts w:ascii="Cambria Math" w:hAnsi="Cambria Math"/>
+          <w:sz w:val="18"/>
+          <w:szCs w:val="18"/>
+          <w:lang w:val="es-CO"/>
+        </w:rPr>
+      </w:pPr>
+      <w:r>
+        <w:rPr>
+          <w:rFonts w:ascii="Cambria Math" w:hAnsi="Cambria Math"/>
+          <w:sz w:val="18"/>
+          <w:szCs w:val="18"/>
+          <w:lang w:val="es-CO"/>
+        </w:rPr>
+        <w:t>6.3 Verificación</w:t>
+      </w:r>
+    </w:p>
+    <w:p>
+      <w:pPr>
+        <w:pStyle w:val="Ttulo2"/>
+        <w:jc w:val="both"/>
+        <w:rPr>
+          <w:rFonts w:ascii="Cambria Math" w:eastAsiaTheme="minorEastAsia" w:hAnsi="Cambria Math" w:cstheme="minorBidi"/>
+          <w:b w:val="0"/>
+          <w:bCs w:val="0"/>
+          <w:color w:val="auto"/>
+          <w:sz w:val="18"/>
+          <w:szCs w:val="18"/>
+          <w:lang w:val="es-CO"/>
+        </w:rPr>
+      </w:pPr>
+      <w:r>
+        <w:rPr>
+          <w:rFonts w:ascii="Cambria Math" w:eastAsiaTheme="minorEastAsia" w:hAnsi="Cambria Math" w:cstheme="minorBidi"/>
+          <w:b w:val="0"/>
+          <w:bCs w:val="0"/>
+          <w:color w:val="auto"/>
+          <w:sz w:val="18"/>
+          <w:szCs w:val="18"/>
+          <w:lang w:val="es-CO"/>
+        </w:rPr>
+        <w:t>Se contempló la validación de la ejecución de la aplicación, disponibilidad de los módulos y funcionamiento de las principales interacciones del dashboard. La verificación final del acceso externo queda sujeta a la implementación del entorno EC2.</w:t>
+      </w:r>
+    </w:p>
+    <w:p>
+      <w:pPr>
+        <w:pStyle w:val="Ttulo2"/>
+        <w:jc w:val="both"/>
+        <w:rPr>
+          <w:rFonts w:ascii="Cambria Math" w:hAnsi="Cambria Math"/>
+          <w:sz w:val="18"/>
+          <w:szCs w:val="18"/>
+          <w:lang w:val="es-CO"/>
+        </w:rPr>
+      </w:pPr>
+      <w:r>
+        <w:rPr>
+          <w:rFonts w:ascii="Cambria Math" w:hAnsi="Cambria Math"/>
+          <w:sz w:val="18"/>
+          <w:szCs w:val="18"/>
+          <w:lang w:val="es-CO"/>
+        </w:rPr>
+        <w:t>6.4 Mantenimiento y replicabilidad</w:t>
+      </w:r>
+    </w:p>
+    <w:p>
+      <w:pPr>
         <w:spacing w:after="80"/>
         <w:jc w:val="both"/>
         <w:rPr>
@@ -5864,7 +6055,7 @@
           <w:szCs w:val="18"/>
           <w:lang w:val="es-CO"/>
         </w:rPr>
-        <w:t>[Describir los pasos realizados en AWS EC2, ejecución, verificación, mantenimiento y evidencias.]</w:t>
+        <w:t>La estructura del proyecto y el repositorio GitHub permiten mantener versionado el código y replicar la solución en otro entorno. La organización de archivos facilita futuras actualizaciones de los módulos, datos y componentes del dashboard.</w:t>
       </w:r>
     </w:p>
     <w:p>
@@ -5885,7 +6076,7 @@
           <w:szCs w:val="18"/>
           <w:lang w:val="es-CO"/>
         </w:rPr>
-        <w:t>6.3 Verificación</w:t>
+        <w:t>6.5 Evidencias</w:t>
       </w:r>
     </w:p>
     <w:p>
@@ -5906,32 +6097,11 @@
           <w:szCs w:val="18"/>
           <w:lang w:val="es-CO"/>
         </w:rPr>
-        <w:t>[Describir los pasos realizados en AWS EC2, ejecución, verificación, mantenimiento y evidencias.]</w:t>
+        <w:t>Se documentaron los recursos y procedimientos asociados al entorno de ejecución y se preparó el material necesario para registrar la implementación. Las evidencias específicas del despliegue en EC2 y la URL pública deberán incorporarse una vez finalizada dicha implementación.</w:t>
       </w:r>
     </w:p>
     <w:p>
       <w:pPr>
-        <w:pStyle w:val="Ttulo2"/>
-        <w:jc w:val="both"/>
-        <w:rPr>
-          <w:rFonts w:ascii="Cambria Math" w:hAnsi="Cambria Math"/>
-          <w:sz w:val="18"/>
-          <w:szCs w:val="18"/>
-          <w:lang w:val="es-CO"/>
-        </w:rPr>
-      </w:pPr>
-      <w:r>
-        <w:rPr>
-          <w:rFonts w:ascii="Cambria Math" w:hAnsi="Cambria Math"/>
-          <w:sz w:val="18"/>
-          <w:szCs w:val="18"/>
-          <w:lang w:val="es-CO"/>
-        </w:rPr>
-        <w:t>6.4 Mantenimiento y replicabilidad</w:t>
-      </w:r>
-    </w:p>
-    <w:p>
-      <w:pPr>
         <w:spacing w:after="80"/>
         <w:jc w:val="both"/>
         <w:rPr>
@@ -5941,72 +6111,9 @@
           <w:lang w:val="es-CO"/>
         </w:rPr>
       </w:pPr>
-      <w:r>
-        <w:rPr>
-          <w:rFonts w:ascii="Cambria Math" w:hAnsi="Cambria Math"/>
-          <w:sz w:val="18"/>
-          <w:szCs w:val="18"/>
-          <w:lang w:val="es-CO"/>
-        </w:rPr>
-        <w:t>[Describir los pasos realizados en AWS EC2, ejecución, verificación, mantenimiento y evidencias.]</w:t>
-      </w:r>
-    </w:p>
-    <w:p>
-      <w:pPr>
-        <w:pStyle w:val="Ttulo2"/>
-        <w:jc w:val="both"/>
-        <w:rPr>
-          <w:rFonts w:ascii="Cambria Math" w:hAnsi="Cambria Math"/>
-          <w:sz w:val="18"/>
-          <w:szCs w:val="18"/>
-          <w:lang w:val="es-CO"/>
-        </w:rPr>
-      </w:pPr>
-      <w:r>
-        <w:rPr>
-          <w:rFonts w:ascii="Cambria Math" w:hAnsi="Cambria Math"/>
-          <w:sz w:val="18"/>
-          <w:szCs w:val="18"/>
-          <w:lang w:val="es-CO"/>
-        </w:rPr>
-        <w:t>6.5 Evidencias</w:t>
-      </w:r>
-    </w:p>
-    <w:p>
-      <w:pPr>
-        <w:spacing w:after="80"/>
-        <w:jc w:val="both"/>
-        <w:rPr>
-          <w:rFonts w:ascii="Cambria Math" w:hAnsi="Cambria Math"/>
-          <w:sz w:val="18"/>
-          <w:szCs w:val="18"/>
-          <w:lang w:val="es-CO"/>
-        </w:rPr>
-      </w:pPr>
-      <w:r>
-        <w:rPr>
-          <w:rFonts w:ascii="Cambria Math" w:hAnsi="Cambria Math"/>
-          <w:sz w:val="18"/>
-          <w:szCs w:val="18"/>
-          <w:lang w:val="es-CO"/>
-        </w:rPr>
-        <w:t>[Describir los pasos realizados en AWS EC2, ejecución, verificación, mantenimiento y evidencias.]</w:t>
-      </w:r>
-    </w:p>
-    <w:p>
-      <w:pPr>
-        <w:spacing w:after="80"/>
-        <w:jc w:val="both"/>
-        <w:rPr>
-          <w:rFonts w:ascii="Cambria Math" w:hAnsi="Cambria Math"/>
-          <w:sz w:val="18"/>
-          <w:szCs w:val="18"/>
-          <w:lang w:val="es-CO"/>
-        </w:rPr>
-      </w:pPr>
     </w:p>
     <w:sectPr>
-      <w:footerReference w:type="default" r:id="rId9"/>
+      <w:footerReference w:type="default" r:id="rId13"/>
       <w:pgSz w:w="12240" w:h="15840"/>
       <w:pgMar w:top="964" w:right="1020" w:bottom="964" w:left="1020" w:header="720" w:footer="720" w:gutter="0"/>
       <w:cols w:space="720"/>
@@ -7192,7 +7299,6 @@
   <w:style w:type="character" w:default="1" w:styleId="Fuentedeprrafopredeter">
     <w:name w:val="Default Paragraph Font"/>
     <w:uiPriority w:val="1"/>
-    <w:semiHidden/>
     <w:unhideWhenUsed/>
   </w:style>
   <w:style w:type="table" w:default="1" w:styleId="Tablanormal">

</xml_diff>

<commit_message>
Actualiza reporte y soporte de despliegue
</commit_message>
<xml_diff>
--- a/Entregables/Reporte_Proyecto_1.docx
+++ b/Entregables/Reporte_Proyecto_1.docx
@@ -2058,16 +2058,7 @@
           <w:szCs w:val="18"/>
           <w:lang w:val="es-CO"/>
         </w:rPr>
-        <w:t>.</w:t>
-      </w:r>
-      <w:r>
-        <w:rPr>
-          <w:rFonts w:ascii="Cambria Math" w:hAnsi="Cambria Math"/>
-          <w:sz w:val="18"/>
-          <w:szCs w:val="18"/>
-          <w:lang w:val="es-CO"/>
-        </w:rPr>
-        <w:t xml:space="preserve"> </w:t>
+        <w:t xml:space="preserve">. </w:t>
       </w:r>
     </w:p>
     <w:p>
@@ -2184,6 +2175,7 @@
       <w:r>
         <w:rPr>
           <w:rFonts w:ascii="Cambria Math" w:hAnsi="Cambria Math"/>
+          <w:noProof/>
           <w:sz w:val="18"/>
           <w:szCs w:val="18"/>
         </w:rPr>
@@ -3974,6 +3966,7 @@
       <w:r>
         <w:rPr>
           <w:rFonts w:ascii="Cambria Math" w:hAnsi="Cambria Math"/>
+          <w:noProof/>
         </w:rPr>
         <w:drawing>
           <wp:inline distT="0" distB="0" distL="0" distR="0" wp14:anchorId="78A854B9" wp14:editId="33FF235A">
@@ -4663,16 +4656,7 @@
           <w:szCs w:val="18"/>
           <w:lang w:val="es-CO"/>
         </w:rPr>
-        <w:t xml:space="preserve"> </w:t>
-      </w:r>
-      <w:r>
-        <w:rPr>
-          <w:rFonts w:ascii="Cambria Math" w:hAnsi="Cambria Math"/>
-          <w:sz w:val="18"/>
-          <w:szCs w:val="18"/>
-          <w:lang w:val="es-CO"/>
-        </w:rPr>
-        <w:t>Se obtuvo una base analítica preparada para evaluar la concentración de la contratación desde las perspectivas de proveedores, modalidades y tipos de contrato. El resultado permitió generar los indicadores y visualizaciones utilizados para responder la pregunta de negocio.</w:t>
+        <w:t xml:space="preserve"> Se obtuvo una base analítica preparada para evaluar la concentración de la contratación desde las perspectivas de proveedores, modalidades y tipos de contrato. El resultado permitió generar los indicadores y visualizaciones utilizados para responder la pregunta de negocio.</w:t>
       </w:r>
     </w:p>
     <w:p>
@@ -4785,16 +4769,7 @@
           <w:szCs w:val="18"/>
           <w:lang w:val="es-CO"/>
         </w:rPr>
-        <w:t xml:space="preserve"> </w:t>
-      </w:r>
-      <w:r>
-        <w:rPr>
-          <w:rFonts w:ascii="Cambria Math" w:hAnsi="Cambria Math"/>
-          <w:sz w:val="18"/>
-          <w:szCs w:val="18"/>
-          <w:lang w:val="es-CO"/>
-        </w:rPr>
-        <w:t>Se documentaron las etapas de auditoría, limpieza y alistamiento mediante notebooks de Python y archivos de datos resultantes. Las evidencias incluyen los análisis utilizados para construir los indicadores de concentración y el tablero desarrollado para su visualización.</w:t>
+        <w:t xml:space="preserve"> Se documentaron las etapas de auditoría, limpieza y alistamiento mediante notebooks de Python y archivos de datos resultantes. Las evidencias incluyen los análisis utilizados para construir los indicadores de concentración y el tablero desarrollado para su visualización.</w:t>
       </w:r>
     </w:p>
     <w:p>
@@ -5278,16 +5253,7 @@
           <w:szCs w:val="18"/>
           <w:lang w:val="es-CO"/>
         </w:rPr>
-        <w:t xml:space="preserve"> </w:t>
-      </w:r>
-      <w:r>
-        <w:rPr>
-          <w:rFonts w:ascii="Cambria Math" w:hAnsi="Cambria Math"/>
-          <w:sz w:val="18"/>
-          <w:szCs w:val="18"/>
-          <w:lang w:val="es-CO"/>
-        </w:rPr>
-        <w:t>Se implementó el módulo de Pregunta 1 en Dash, incorporando indicadores de concentración, visualizaciones y filtros para explorar la distribución del valor contratado y el número de contratos.</w:t>
+        <w:t xml:space="preserve"> Se implementó el módulo de Pregunta 1 en Dash, incorporando indicadores de concentración, visualizaciones y filtros para explorar la distribución del valor contratado y el número de contratos.</w:t>
       </w:r>
     </w:p>
     <w:p>
@@ -6097,7 +6063,16 @@
           <w:szCs w:val="18"/>
           <w:lang w:val="es-CO"/>
         </w:rPr>
-        <w:t>Se documentaron los recursos y procedimientos asociados al entorno de ejecución y se preparó el material necesario para registrar la implementación. Las evidencias específicas del despliegue en EC2 y la URL pública deberán incorporarse una vez finalizada dicha implementación.</w:t>
+        <w:t xml:space="preserve">Se documentaron los recursos y procedimientos asociados al entorno de ejecución y se preparó el material necesario para registrar la implementación. Las evidencias específicas del despliegue en EC2 y la URL </w:t>
+      </w:r>
+      <w:r>
+        <w:rPr>
+          <w:rFonts w:ascii="Cambria Math" w:hAnsi="Cambria Math"/>
+          <w:sz w:val="18"/>
+          <w:szCs w:val="18"/>
+          <w:lang w:val="es-CO"/>
+        </w:rPr>
+        <w:t>son las siguientes:</w:t>
       </w:r>
     </w:p>
     <w:p>
@@ -6112,8 +6087,108 @@
         </w:rPr>
       </w:pPr>
     </w:p>
+    <w:p>
+      <w:pPr>
+        <w:spacing w:after="80"/>
+        <w:jc w:val="both"/>
+        <w:rPr>
+          <w:rFonts w:ascii="Cambria Math" w:hAnsi="Cambria Math"/>
+          <w:sz w:val="18"/>
+          <w:szCs w:val="18"/>
+          <w:lang w:val="es-CO"/>
+        </w:rPr>
+      </w:pPr>
+      <w:r>
+        <w:rPr>
+          <w:rFonts w:ascii="Cambria Math" w:hAnsi="Cambria Math"/>
+          <w:sz w:val="18"/>
+          <w:szCs w:val="18"/>
+          <w:lang w:val="es-CO"/>
+        </w:rPr>
+        <w:t xml:space="preserve">URL </w:t>
+      </w:r>
+      <w:hyperlink r:id="rId13" w:history="1">
+        <w:r>
+          <w:rPr>
+            <w:rStyle w:val="Hipervnculo"/>
+            <w:rFonts w:ascii="Cambria Math" w:hAnsi="Cambria Math"/>
+            <w:sz w:val="18"/>
+            <w:szCs w:val="18"/>
+            <w:lang w:val="es-CO"/>
+          </w:rPr>
+          <w:t>http://13.219.17.0:8050/</w:t>
+        </w:r>
+      </w:hyperlink>
+    </w:p>
+    <w:p>
+      <w:pPr>
+        <w:spacing w:after="80"/>
+        <w:jc w:val="both"/>
+        <w:rPr>
+          <w:rFonts w:ascii="Cambria Math" w:hAnsi="Cambria Math"/>
+          <w:sz w:val="18"/>
+          <w:szCs w:val="18"/>
+          <w:lang w:val="es-CO"/>
+        </w:rPr>
+      </w:pPr>
+    </w:p>
+    <w:p>
+      <w:pPr>
+        <w:spacing w:after="80"/>
+        <w:jc w:val="center"/>
+        <w:rPr>
+          <w:rFonts w:ascii="Cambria Math" w:hAnsi="Cambria Math"/>
+          <w:sz w:val="18"/>
+          <w:szCs w:val="18"/>
+          <w:lang w:val="es-CO"/>
+        </w:rPr>
+      </w:pPr>
+      <w:r>
+        <w:rPr>
+          <w:rFonts w:ascii="Cambria Math" w:hAnsi="Cambria Math"/>
+          <w:sz w:val="18"/>
+          <w:szCs w:val="18"/>
+          <w:lang w:val="es-CO"/>
+        </w:rPr>
+        <w:drawing>
+          <wp:inline distT="0" distB="0" distL="0" distR="0" wp14:anchorId="42929A5B" wp14:editId="4337ABF1">
+            <wp:extent cx="5899574" cy="3357552"/>
+            <wp:effectExtent l="0" t="0" r="0" b="0"/>
+            <wp:docPr id="1309708380" name="Imagen 1"/>
+            <wp:cNvGraphicFramePr>
+              <a:graphicFrameLocks xmlns:a="http://schemas.openxmlformats.org/drawingml/2006/main" noChangeAspect="1"/>
+            </wp:cNvGraphicFramePr>
+            <a:graphic xmlns:a="http://schemas.openxmlformats.org/drawingml/2006/main">
+              <a:graphicData uri="http://schemas.openxmlformats.org/drawingml/2006/picture">
+                <pic:pic xmlns:pic="http://schemas.openxmlformats.org/drawingml/2006/picture">
+                  <pic:nvPicPr>
+                    <pic:cNvPr id="1309708380" name=""/>
+                    <pic:cNvPicPr/>
+                  </pic:nvPicPr>
+                  <pic:blipFill>
+                    <a:blip r:embed="rId14"/>
+                    <a:stretch>
+                      <a:fillRect/>
+                    </a:stretch>
+                  </pic:blipFill>
+                  <pic:spPr>
+                    <a:xfrm>
+                      <a:off x="0" y="0"/>
+                      <a:ext cx="5941237" cy="3381263"/>
+                    </a:xfrm>
+                    <a:prstGeom prst="rect">
+                      <a:avLst/>
+                    </a:prstGeom>
+                  </pic:spPr>
+                </pic:pic>
+              </a:graphicData>
+            </a:graphic>
+          </wp:inline>
+        </w:drawing>
+      </w:r>
+    </w:p>
     <w:sectPr>
-      <w:footerReference w:type="default" r:id="rId13"/>
+      <w:footerReference w:type="default" r:id="rId15"/>
       <w:pgSz w:w="12240" w:h="15840"/>
       <w:pgMar w:top="964" w:right="1020" w:bottom="964" w:left="1020" w:header="720" w:footer="720" w:gutter="0"/>
       <w:cols w:space="720"/>
@@ -7299,6 +7374,7 @@
   <w:style w:type="character" w:default="1" w:styleId="Fuentedeprrafopredeter">
     <w:name w:val="Default Paragraph Font"/>
     <w:uiPriority w:val="1"/>
+    <w:semiHidden/>
     <w:unhideWhenUsed/>
   </w:style>
   <w:style w:type="table" w:default="1" w:styleId="Tablanormal">
@@ -18171,6 +18247,29 @@
       </w:tcPr>
     </w:tblStylePr>
   </w:style>
+  <w:style w:type="character" w:styleId="Hipervnculo">
+    <w:name w:val="Hyperlink"/>
+    <w:basedOn w:val="Fuentedeprrafopredeter"/>
+    <w:uiPriority w:val="99"/>
+    <w:unhideWhenUsed/>
+    <w:rsid w:val="00154132"/>
+    <w:rPr>
+      <w:color w:val="0000FF" w:themeColor="hyperlink"/>
+      <w:u w:val="single"/>
+    </w:rPr>
+  </w:style>
+  <w:style w:type="character" w:styleId="Mencinsinresolver">
+    <w:name w:val="Unresolved Mention"/>
+    <w:basedOn w:val="Fuentedeprrafopredeter"/>
+    <w:uiPriority w:val="99"/>
+    <w:semiHidden/>
+    <w:unhideWhenUsed/>
+    <w:rsid w:val="00154132"/>
+    <w:rPr>
+      <w:color w:val="605E5C"/>
+      <w:shd w:val="clear" w:color="auto" w:fill="E1DFDD"/>
+    </w:rPr>
+  </w:style>
 </w:styles>
 </file>
 

</xml_diff>